<commit_message>
Update the ENKO site handover plan
Refresh the Word, HTML, and canvas copies in docs/.
</commit_message>
<xml_diff>
--- a/docs/site-handover-plan.docx
+++ b/docs/site-handover-plan.docx
@@ -171,6 +171,11 @@
     <w:p>
       <w:r>
         <w:t>Гипотеза: продающая поверхность — enco.ru, лендинги и поддомены проектов, encobroker.ru, encocatalog.ru — размещена на коробке Битрикс24, которую администрирует разработчик, а не на ресурсах контура ЭНКО. Поддержка и дальнейшая разработка после переноса идут уже внутри контура. Пока инвентаризация гипотезу не сняла, коробку разработчика не выключают: она остаётся боем и точкой отката.</w:t>
+      </w:r>
+    </w:p>
+    <w:p>
+      <w:r>
+        <w:t>Второй источник — общий чат с разбором приёмки сайта на Битрикс. Это тоже не осмотр серверов ЭНКО: страница помечена как разговор, сгенерированный моделью, для ориентира. Чат сам делит три продукта: облако Битрикс24, «1С-Битрикс: Управление сайтом» и чужую коробку Битрикс24, которая должна стать своей. В план вложено только то, что чат относит к коробке и что совпадает с допущением. Облачный чек-лист и общий CMS-контур в работу не берутся. Где чат и разбор заявок говорят разное, в плане остаются оба утверждения и подписан источник.</w:t>
       </w:r>
     </w:p>
     <w:p>
@@ -3663,6 +3668,674 @@
     </w:p>
     <w:p>
       <w:pPr>
+        <w:pStyle w:val="Heading3"/>
+      </w:pPr>
+      <w:r>
+        <w:t>Что чат добавляет к инвентарю коробки</w:t>
+      </w:r>
+    </w:p>
+    <w:p>
+      <w:r>
+        <w:t>Ниже пункты из чата про чужую коробку Битрикс24, которой должна владеть компания, а не подрядчик. Разбор поддержки эти пути, ключи и учётные записи сервера не называет. Пока разработчик их не показал, это список требований, не описание боя.</w:t>
+      </w:r>
+    </w:p>
+    <w:tbl>
+      <w:tblPr>
+        <w:tblStyle w:val="TableGrid"/>
+        <w:tblW w:type="dxa" w:w="9979"/>
+        <w:tblLayout w:type="fixed"/>
+        <w:tblLook w:firstColumn="1" w:firstRow="1" w:lastColumn="0" w:lastRow="0" w:noHBand="0" w:noVBand="1" w:val="04A0"/>
+      </w:tblPr>
+      <w:tblGrid>
+        <w:gridCol w:w="2041"/>
+        <w:gridCol w:w="6237"/>
+        <w:gridCol w:w="1701"/>
+      </w:tblGrid>
+      <w:tr>
+        <w:trPr>
+          <w:tblHeader w:val="true"/>
+        </w:trPr>
+        <w:tc>
+          <w:tcPr>
+            <w:tcW w:type="dxa" w:w="2041"/>
+            <w:shd w:val="clear" w:color="auto" w:fill="1E2A24"/>
+            <w:vAlign w:val="top"/>
+          </w:tcPr>
+          <w:p>
+            <w:pPr>
+              <w:spacing w:after="40" w:before="40"/>
+            </w:pPr>
+            <w:r>
+              <w:rPr>
+                <w:rFonts w:ascii="Calibri" w:hAnsi="Calibri" w:eastAsia="Calibri"/>
+                <w:b/>
+                <w:i w:val="0"/>
+                <w:color w:val="F4F1EA"/>
+                <w:sz w:val="20"/>
+              </w:rPr>
+              <w:t>Что забрать</w:t>
+            </w:r>
+          </w:p>
+        </w:tc>
+        <w:tc>
+          <w:tcPr>
+            <w:tcW w:type="dxa" w:w="6237"/>
+            <w:shd w:val="clear" w:color="auto" w:fill="1E2A24"/>
+            <w:vAlign w:val="top"/>
+          </w:tcPr>
+          <w:p>
+            <w:pPr>
+              <w:spacing w:after="40" w:before="40"/>
+            </w:pPr>
+            <w:r>
+              <w:rPr>
+                <w:rFonts w:ascii="Calibri" w:hAnsi="Calibri" w:eastAsia="Calibri"/>
+                <w:b/>
+                <w:i w:val="0"/>
+                <w:color w:val="F4F1EA"/>
+                <w:sz w:val="20"/>
+              </w:rPr>
+              <w:t>Как чат это формулирует</w:t>
+            </w:r>
+          </w:p>
+        </w:tc>
+        <w:tc>
+          <w:tcPr>
+            <w:tcW w:type="dxa" w:w="1701"/>
+            <w:shd w:val="clear" w:color="auto" w:fill="1E2A24"/>
+            <w:vAlign w:val="top"/>
+          </w:tcPr>
+          <w:p>
+            <w:pPr>
+              <w:spacing w:after="40" w:before="40"/>
+            </w:pPr>
+            <w:r>
+              <w:rPr>
+                <w:rFonts w:ascii="Calibri" w:hAnsi="Calibri" w:eastAsia="Calibri"/>
+                <w:b/>
+                <w:i w:val="0"/>
+                <w:color w:val="F4F1EA"/>
+                <w:sz w:val="20"/>
+              </w:rPr>
+              <w:t>Владелец</w:t>
+            </w:r>
+          </w:p>
+        </w:tc>
+      </w:tr>
+      <w:tr>
+        <w:tc>
+          <w:tcPr>
+            <w:tcW w:type="dxa" w:w="2041"/>
+            <w:vAlign w:val="top"/>
+          </w:tcPr>
+          <w:p>
+            <w:pPr>
+              <w:spacing w:after="40" w:before="40"/>
+            </w:pPr>
+            <w:r>
+              <w:rPr>
+                <w:rFonts w:ascii="Calibri" w:hAnsi="Calibri" w:eastAsia="Calibri"/>
+                <w:b w:val="0"/>
+                <w:i w:val="0"/>
+                <w:sz w:val="20"/>
+              </w:rPr>
+              <w:t>Чья машина</w:t>
+            </w:r>
+          </w:p>
+        </w:tc>
+        <w:tc>
+          <w:tcPr>
+            <w:tcW w:type="dxa" w:w="6237"/>
+            <w:vAlign w:val="top"/>
+          </w:tcPr>
+          <w:p>
+            <w:pPr>
+              <w:spacing w:after="40" w:before="40"/>
+            </w:pPr>
+            <w:r>
+              <w:rPr>
+                <w:rFonts w:ascii="Calibri" w:hAnsi="Calibri" w:eastAsia="Calibri"/>
+                <w:b w:val="0"/>
+                <w:i w:val="0"/>
+                <w:sz w:val="20"/>
+              </w:rPr>
+              <w:t>IP, root, SSH/SFTP, панель сервера. Арендует ли ВМ подрядчик или это его железо. Без этого коробку можно выключить вместе с аккаунтом подрядчика.</w:t>
+            </w:r>
+          </w:p>
+        </w:tc>
+        <w:tc>
+          <w:tcPr>
+            <w:tcW w:type="dxa" w:w="1701"/>
+            <w:vAlign w:val="top"/>
+          </w:tcPr>
+          <w:p>
+            <w:pPr>
+              <w:spacing w:after="40" w:before="40"/>
+            </w:pPr>
+            <w:r>
+              <w:rPr>
+                <w:rFonts w:ascii="Calibri" w:hAnsi="Calibri" w:eastAsia="Calibri"/>
+                <w:b/>
+                <w:i w:val="0"/>
+                <w:sz w:val="20"/>
+              </w:rPr>
+              <w:t>разработчик</w:t>
+            </w:r>
+          </w:p>
+        </w:tc>
+      </w:tr>
+      <w:tr>
+        <w:tc>
+          <w:tcPr>
+            <w:tcW w:type="dxa" w:w="2041"/>
+            <w:shd w:val="clear" w:color="auto" w:fill="F7F4EE"/>
+            <w:vAlign w:val="top"/>
+          </w:tcPr>
+          <w:p>
+            <w:pPr>
+              <w:spacing w:after="40" w:before="40"/>
+            </w:pPr>
+            <w:r>
+              <w:rPr>
+                <w:rFonts w:ascii="Calibri" w:hAnsi="Calibri" w:eastAsia="Calibri"/>
+                <w:b w:val="0"/>
+                <w:i w:val="0"/>
+                <w:sz w:val="20"/>
+              </w:rPr>
+              <w:t>Ключ и кабинет вендора</w:t>
+            </w:r>
+          </w:p>
+        </w:tc>
+        <w:tc>
+          <w:tcPr>
+            <w:tcW w:type="dxa" w:w="6237"/>
+            <w:shd w:val="clear" w:color="auto" w:fill="F7F4EE"/>
+            <w:vAlign w:val="top"/>
+          </w:tcPr>
+          <w:p>
+            <w:pPr>
+              <w:spacing w:after="40" w:before="40"/>
+            </w:pPr>
+            <w:r>
+              <w:rPr>
+                <w:rFonts w:ascii="Calibri" w:hAnsi="Calibri" w:eastAsia="Calibri"/>
+                <w:b w:val="0"/>
+                <w:i w:val="0"/>
+                <w:sz w:val="20"/>
+              </w:rPr>
+              <w:t>Лицензионный ключ коробки привязан к аккаунту компании на 1c-bitrix.ru. Если в кабинете до сих пор подрядчик, ключ передают и лицензию удаляют из его учётной записи.</w:t>
+            </w:r>
+          </w:p>
+        </w:tc>
+        <w:tc>
+          <w:tcPr>
+            <w:tcW w:type="dxa" w:w="1701"/>
+            <w:shd w:val="clear" w:color="auto" w:fill="F7F4EE"/>
+            <w:vAlign w:val="top"/>
+          </w:tcPr>
+          <w:p>
+            <w:pPr>
+              <w:spacing w:after="40" w:before="40"/>
+            </w:pPr>
+            <w:r>
+              <w:rPr>
+                <w:rFonts w:ascii="Calibri" w:hAnsi="Calibri" w:eastAsia="Calibri"/>
+                <w:b/>
+                <w:i w:val="0"/>
+                <w:sz w:val="20"/>
+              </w:rPr>
+              <w:t>разработчик</w:t>
+            </w:r>
+          </w:p>
+        </w:tc>
+      </w:tr>
+      <w:tr>
+        <w:tc>
+          <w:tcPr>
+            <w:tcW w:type="dxa" w:w="2041"/>
+            <w:vAlign w:val="top"/>
+          </w:tcPr>
+          <w:p>
+            <w:pPr>
+              <w:spacing w:after="40" w:before="40"/>
+            </w:pPr>
+            <w:r>
+              <w:rPr>
+                <w:rFonts w:ascii="Calibri" w:hAnsi="Calibri" w:eastAsia="Calibri"/>
+                <w:b w:val="0"/>
+                <w:i w:val="0"/>
+                <w:sz w:val="20"/>
+              </w:rPr>
+              <w:t>Исходные тексты</w:t>
+            </w:r>
+          </w:p>
+        </w:tc>
+        <w:tc>
+          <w:tcPr>
+            <w:tcW w:type="dxa" w:w="6237"/>
+            <w:vAlign w:val="top"/>
+          </w:tcPr>
+          <w:p>
+            <w:pPr>
+              <w:spacing w:after="40" w:before="40"/>
+            </w:pPr>
+            <w:r>
+              <w:rPr>
+                <w:rFonts w:ascii="Calibri" w:hAnsi="Calibri" w:eastAsia="Calibri"/>
+                <w:b w:val="0"/>
+                <w:i w:val="0"/>
+                <w:sz w:val="20"/>
+              </w:rPr>
+              <w:t>Лицензия должна позволять загрузку исходного кода. В панели показывают пункт загрузки исходных текстов. Без этого доработки остаются у подрядчика.</w:t>
+            </w:r>
+          </w:p>
+        </w:tc>
+        <w:tc>
+          <w:tcPr>
+            <w:tcW w:type="dxa" w:w="1701"/>
+            <w:vAlign w:val="top"/>
+          </w:tcPr>
+          <w:p>
+            <w:pPr>
+              <w:spacing w:after="40" w:before="40"/>
+            </w:pPr>
+            <w:r>
+              <w:rPr>
+                <w:rFonts w:ascii="Calibri" w:hAnsi="Calibri" w:eastAsia="Calibri"/>
+                <w:b/>
+                <w:i w:val="0"/>
+                <w:sz w:val="20"/>
+              </w:rPr>
+              <w:t>разработчик</w:t>
+            </w:r>
+          </w:p>
+        </w:tc>
+      </w:tr>
+      <w:tr>
+        <w:tc>
+          <w:tcPr>
+            <w:tcW w:type="dxa" w:w="2041"/>
+            <w:shd w:val="clear" w:color="auto" w:fill="F7F4EE"/>
+            <w:vAlign w:val="top"/>
+          </w:tcPr>
+          <w:p>
+            <w:pPr>
+              <w:spacing w:after="40" w:before="40"/>
+            </w:pPr>
+            <w:r>
+              <w:rPr>
+                <w:rFonts w:ascii="Calibri" w:hAnsi="Calibri" w:eastAsia="Calibri"/>
+                <w:b w:val="0"/>
+                <w:i w:val="0"/>
+                <w:sz w:val="20"/>
+              </w:rPr>
+              <w:t>Git и каталог /local/</w:t>
+            </w:r>
+          </w:p>
+        </w:tc>
+        <w:tc>
+          <w:tcPr>
+            <w:tcW w:type="dxa" w:w="6237"/>
+            <w:shd w:val="clear" w:color="auto" w:fill="F7F4EE"/>
+            <w:vAlign w:val="top"/>
+          </w:tcPr>
+          <w:p>
+            <w:pPr>
+              <w:spacing w:after="40" w:before="40"/>
+            </w:pPr>
+            <w:r>
+              <w:rPr>
+                <w:rFonts w:ascii="Calibri" w:hAnsi="Calibri" w:eastAsia="Calibri"/>
+                <w:b w:val="0"/>
+                <w:i w:val="0"/>
+                <w:sz w:val="20"/>
+              </w:rPr>
+              <w:t>История коммитов, не архив. Свой код лежит в /local/, а не вперемешку с ядром в /bitrix/. Чат называет правки ядра красным флагом: обновление их сотрёт.</w:t>
+            </w:r>
+          </w:p>
+        </w:tc>
+        <w:tc>
+          <w:tcPr>
+            <w:tcW w:type="dxa" w:w="1701"/>
+            <w:shd w:val="clear" w:color="auto" w:fill="F7F4EE"/>
+            <w:vAlign w:val="top"/>
+          </w:tcPr>
+          <w:p>
+            <w:pPr>
+              <w:spacing w:after="40" w:before="40"/>
+            </w:pPr>
+            <w:r>
+              <w:rPr>
+                <w:rFonts w:ascii="Calibri" w:hAnsi="Calibri" w:eastAsia="Calibri"/>
+                <w:b/>
+                <w:i w:val="0"/>
+                <w:sz w:val="20"/>
+              </w:rPr>
+              <w:t>разработчик</w:t>
+            </w:r>
+          </w:p>
+        </w:tc>
+      </w:tr>
+      <w:tr>
+        <w:tc>
+          <w:tcPr>
+            <w:tcW w:type="dxa" w:w="2041"/>
+            <w:vAlign w:val="top"/>
+          </w:tcPr>
+          <w:p>
+            <w:pPr>
+              <w:spacing w:after="40" w:before="40"/>
+            </w:pPr>
+            <w:r>
+              <w:rPr>
+                <w:rFonts w:ascii="Calibri" w:hAnsi="Calibri" w:eastAsia="Calibri"/>
+                <w:b w:val="0"/>
+                <w:i w:val="0"/>
+                <w:sz w:val="20"/>
+              </w:rPr>
+              <w:t>Дата ядра</w:t>
+            </w:r>
+          </w:p>
+        </w:tc>
+        <w:tc>
+          <w:tcPr>
+            <w:tcW w:type="dxa" w:w="6237"/>
+            <w:vAlign w:val="top"/>
+          </w:tcPr>
+          <w:p>
+            <w:pPr>
+              <w:spacing w:after="40" w:before="40"/>
+            </w:pPr>
+            <w:r>
+              <w:rPr>
+                <w:rFonts w:ascii="Calibri" w:hAnsi="Calibri" w:eastAsia="Calibri"/>
+                <w:b w:val="0"/>
+                <w:i w:val="0"/>
+                <w:sz w:val="20"/>
+              </w:rPr>
+              <w:t>Когда последний раз обновляли ядро. Чат считает год без обновлений дырой. Даты в разборе заявок нет.</w:t>
+            </w:r>
+          </w:p>
+        </w:tc>
+        <w:tc>
+          <w:tcPr>
+            <w:tcW w:type="dxa" w:w="1701"/>
+            <w:vAlign w:val="top"/>
+          </w:tcPr>
+          <w:p>
+            <w:pPr>
+              <w:spacing w:after="40" w:before="40"/>
+            </w:pPr>
+            <w:r>
+              <w:rPr>
+                <w:rFonts w:ascii="Calibri" w:hAnsi="Calibri" w:eastAsia="Calibri"/>
+                <w:b/>
+                <w:i w:val="0"/>
+                <w:sz w:val="20"/>
+              </w:rPr>
+              <w:t>разработчик</w:t>
+            </w:r>
+          </w:p>
+        </w:tc>
+      </w:tr>
+      <w:tr>
+        <w:tc>
+          <w:tcPr>
+            <w:tcW w:type="dxa" w:w="2041"/>
+            <w:shd w:val="clear" w:color="auto" w:fill="F7F4EE"/>
+            <w:vAlign w:val="top"/>
+          </w:tcPr>
+          <w:p>
+            <w:pPr>
+              <w:spacing w:after="40" w:before="40"/>
+            </w:pPr>
+            <w:r>
+              <w:rPr>
+                <w:rFonts w:ascii="Calibri" w:hAnsi="Calibri" w:eastAsia="Calibri"/>
+                <w:b w:val="0"/>
+                <w:i w:val="0"/>
+                <w:sz w:val="20"/>
+              </w:rPr>
+              <w:t>Вебхуки коробки</w:t>
+            </w:r>
+          </w:p>
+        </w:tc>
+        <w:tc>
+          <w:tcPr>
+            <w:tcW w:type="dxa" w:w="6237"/>
+            <w:shd w:val="clear" w:color="auto" w:fill="F7F4EE"/>
+            <w:vAlign w:val="top"/>
+          </w:tcPr>
+          <w:p>
+            <w:pPr>
+              <w:spacing w:after="40" w:before="40"/>
+            </w:pPr>
+            <w:r>
+              <w:rPr>
+                <w:rFonts w:ascii="Calibri" w:hAnsi="Calibri" w:eastAsia="Calibri"/>
+                <w:b w:val="0"/>
+                <w:i w:val="0"/>
+                <w:sz w:val="20"/>
+              </w:rPr>
+              <w:t>Реестр, если они есть: имя, входящий или исходящий, приложение с Маркетплейса или нет, чей аккаунт, какие права. Вебхук на аккаунте подрядчика пересоздают на администраторе ЭНКО. Если вебхуков нет, так и пишут.</w:t>
+            </w:r>
+          </w:p>
+        </w:tc>
+        <w:tc>
+          <w:tcPr>
+            <w:tcW w:type="dxa" w:w="1701"/>
+            <w:shd w:val="clear" w:color="auto" w:fill="F7F4EE"/>
+            <w:vAlign w:val="top"/>
+          </w:tcPr>
+          <w:p>
+            <w:pPr>
+              <w:spacing w:after="40" w:before="40"/>
+            </w:pPr>
+            <w:r>
+              <w:rPr>
+                <w:rFonts w:ascii="Calibri" w:hAnsi="Calibri" w:eastAsia="Calibri"/>
+                <w:b/>
+                <w:i w:val="0"/>
+                <w:sz w:val="20"/>
+              </w:rPr>
+              <w:t>разработчик</w:t>
+            </w:r>
+          </w:p>
+        </w:tc>
+      </w:tr>
+      <w:tr>
+        <w:tc>
+          <w:tcPr>
+            <w:tcW w:type="dxa" w:w="2041"/>
+            <w:vAlign w:val="top"/>
+          </w:tcPr>
+          <w:p>
+            <w:pPr>
+              <w:spacing w:after="40" w:before="40"/>
+            </w:pPr>
+            <w:r>
+              <w:rPr>
+                <w:rFonts w:ascii="Calibri" w:hAnsi="Calibri" w:eastAsia="Calibri"/>
+                <w:b w:val="0"/>
+                <w:i w:val="0"/>
+                <w:sz w:val="20"/>
+              </w:rPr>
+              <w:t>Роботы и боты</w:t>
+            </w:r>
+          </w:p>
+        </w:tc>
+        <w:tc>
+          <w:tcPr>
+            <w:tcW w:type="dxa" w:w="6237"/>
+            <w:vAlign w:val="top"/>
+          </w:tcPr>
+          <w:p>
+            <w:pPr>
+              <w:spacing w:after="40" w:before="40"/>
+            </w:pPr>
+            <w:r>
+              <w:rPr>
+                <w:rFonts w:ascii="Calibri" w:hAnsi="Calibri" w:eastAsia="Calibri"/>
+                <w:b w:val="0"/>
+                <w:i w:val="0"/>
+                <w:sz w:val="20"/>
+              </w:rPr>
+              <w:t>Чат просит аудит роботов воронок, открытые линии, Client ID и Client Secret, файл сценария бота. В разборе этого контура нет: лендинг отдаёт заявку в Macro, а чат Битрикс24 в HD-8205 только запасной вариант к Jivo. Пункт закрывается фактом «есть» или «нет».</w:t>
+            </w:r>
+          </w:p>
+        </w:tc>
+        <w:tc>
+          <w:tcPr>
+            <w:tcW w:type="dxa" w:w="1701"/>
+            <w:vAlign w:val="top"/>
+          </w:tcPr>
+          <w:p>
+            <w:pPr>
+              <w:spacing w:after="40" w:before="40"/>
+            </w:pPr>
+            <w:r>
+              <w:rPr>
+                <w:rFonts w:ascii="Calibri" w:hAnsi="Calibri" w:eastAsia="Calibri"/>
+                <w:b/>
+                <w:i w:val="0"/>
+                <w:sz w:val="20"/>
+              </w:rPr>
+              <w:t>разработчик</w:t>
+            </w:r>
+          </w:p>
+        </w:tc>
+      </w:tr>
+      <w:tr>
+        <w:tc>
+          <w:tcPr>
+            <w:tcW w:type="dxa" w:w="2041"/>
+            <w:shd w:val="clear" w:color="auto" w:fill="F7F4EE"/>
+            <w:vAlign w:val="top"/>
+          </w:tcPr>
+          <w:p>
+            <w:pPr>
+              <w:spacing w:after="40" w:before="40"/>
+            </w:pPr>
+            <w:r>
+              <w:rPr>
+                <w:rFonts w:ascii="Calibri" w:hAnsi="Calibri" w:eastAsia="Calibri"/>
+                <w:b w:val="0"/>
+                <w:i w:val="0"/>
+                <w:sz w:val="20"/>
+              </w:rPr>
+              <w:t>Группа редактора</w:t>
+            </w:r>
+          </w:p>
+        </w:tc>
+        <w:tc>
+          <w:tcPr>
+            <w:tcW w:type="dxa" w:w="6237"/>
+            <w:shd w:val="clear" w:color="auto" w:fill="F7F4EE"/>
+            <w:vAlign w:val="top"/>
+          </w:tcPr>
+          <w:p>
+            <w:pPr>
+              <w:spacing w:after="40" w:before="40"/>
+            </w:pPr>
+            <w:r>
+              <w:rPr>
+                <w:rFonts w:ascii="Calibri" w:hAnsi="Calibri" w:eastAsia="Calibri"/>
+                <w:b w:val="0"/>
+                <w:i w:val="0"/>
+                <w:sz w:val="20"/>
+              </w:rPr>
+              <w:t>Тестовый пользователь правит контент и не входит в настройки модулей. Разделы «Контент», «Информационные блоки» и «Настройки» чат относит к «Управлению сайтом», не к коробке Битрикс24. Имена разделов не требуем, пока инвентаризация не покажет этот продукт.</w:t>
+            </w:r>
+          </w:p>
+        </w:tc>
+        <w:tc>
+          <w:tcPr>
+            <w:tcW w:type="dxa" w:w="1701"/>
+            <w:shd w:val="clear" w:color="auto" w:fill="F7F4EE"/>
+            <w:vAlign w:val="top"/>
+          </w:tcPr>
+          <w:p>
+            <w:pPr>
+              <w:spacing w:after="40" w:before="40"/>
+            </w:pPr>
+            <w:r>
+              <w:rPr>
+                <w:rFonts w:ascii="Calibri" w:hAnsi="Calibri" w:eastAsia="Calibri"/>
+                <w:b/>
+                <w:i w:val="0"/>
+                <w:sz w:val="20"/>
+              </w:rPr>
+              <w:t>вместе</w:t>
+            </w:r>
+          </w:p>
+        </w:tc>
+      </w:tr>
+      <w:tr>
+        <w:tc>
+          <w:tcPr>
+            <w:tcW w:type="dxa" w:w="2041"/>
+            <w:vAlign w:val="top"/>
+          </w:tcPr>
+          <w:p>
+            <w:pPr>
+              <w:spacing w:after="40" w:before="40"/>
+            </w:pPr>
+            <w:r>
+              <w:rPr>
+                <w:rFonts w:ascii="Calibri" w:hAnsi="Calibri" w:eastAsia="Calibri"/>
+                <w:b w:val="0"/>
+                <w:i w:val="0"/>
+                <w:sz w:val="20"/>
+              </w:rPr>
+              <w:t>Лицензии на файлы</w:t>
+            </w:r>
+          </w:p>
+        </w:tc>
+        <w:tc>
+          <w:tcPr>
+            <w:tcW w:type="dxa" w:w="6237"/>
+            <w:vAlign w:val="top"/>
+          </w:tcPr>
+          <w:p>
+            <w:pPr>
+              <w:spacing w:after="40" w:before="40"/>
+            </w:pPr>
+            <w:r>
+              <w:rPr>
+                <w:rFonts w:ascii="Calibri" w:hAnsi="Calibri" w:eastAsia="Calibri"/>
+                <w:b w:val="0"/>
+                <w:i w:val="0"/>
+                <w:sz w:val="20"/>
+              </w:rPr>
+              <w:t>Шрифты, фото, платные модули: документ, что право у ЭНКО. Разбор показывает, что картинки приходят с диска и из Figma, но про лицензии молчит.</w:t>
+            </w:r>
+          </w:p>
+        </w:tc>
+        <w:tc>
+          <w:tcPr>
+            <w:tcW w:type="dxa" w:w="1701"/>
+            <w:vAlign w:val="top"/>
+          </w:tcPr>
+          <w:p>
+            <w:pPr>
+              <w:spacing w:after="40" w:before="40"/>
+            </w:pPr>
+            <w:r>
+              <w:rPr>
+                <w:rFonts w:ascii="Calibri" w:hAnsi="Calibri" w:eastAsia="Calibri"/>
+                <w:b/>
+                <w:i w:val="0"/>
+                <w:sz w:val="20"/>
+              </w:rPr>
+              <w:t>разработчик</w:t>
+            </w:r>
+          </w:p>
+        </w:tc>
+      </w:tr>
+    </w:tbl>
+    <w:p/>
+    <w:p>
+      <w:pPr>
         <w:pStyle w:val="Heading2"/>
       </w:pPr>
       <w:r>
@@ -3723,6 +4396,108 @@
     </w:p>
     <w:p>
       <w:pPr>
+        <w:pStyle w:val="Heading3"/>
+      </w:pPr>
+      <w:r>
+        <w:t>Как переезжает чужая коробка</w:t>
+      </w:r>
+    </w:p>
+    <w:p>
+      <w:r>
+        <w:t>Чат отличает перенос коробки от облачного экспорта. В облаке, по чату, экспорт сайта переносит шаблон, а база клиентов остаётся на портале. Для коробки этот способ не применяется. На контур ЭНКО едут дамп базы, архив файлов, Git и ключ лицензии.</w:t>
+      </w:r>
+    </w:p>
+    <w:p>
+      <w:r>
+        <w:t>Перед отключением сервера подрядчика ключ перепривязывают на аккаунт ЭНКО и убирают лицензию из его кабинета. Дамп разворачивают на тестовой среде. Формулировка «бэкап делает хостинг» без такого прогона чат не считает передачей. Разбор просит состав, частоту и место бэкапов. Проверку восстановления добавляет чат.</w:t>
+      </w:r>
+    </w:p>
+    <w:p>
+      <w:r>
+        <w:t>На чужой машине чат требует сменить пароль root операционной системы и MySQL, просмотреть ~/.ssh/authorized_keys, лишних пользователей базы и crontab на обращения к серверам подрядчика. Выкладку ручным FTP в бой чат считает красным флагом: обновление ядра идёт копией, затем тестовой средой, затем продуктивом. Имена стендов, кроме enco.ru/promocalc/, по-прежнему называет разработчик.</w:t>
+      </w:r>
+    </w:p>
+    <w:p>
+      <w:pPr>
+        <w:pStyle w:val="Heading3"/>
+      </w:pPr>
+      <w:r>
+        <w:t>Что приёмка коробки добавляет к темам</w:t>
+      </w:r>
+    </w:p>
+    <w:p>
+      <w:r>
+        <w:t>Темы очереди не заменяются. К ним добавляются проверки коробки из чата, каждая со своим источником.</w:t>
+      </w:r>
+    </w:p>
+    <w:p>
+      <w:pPr>
+        <w:pStyle w:val="ListBullet"/>
+      </w:pPr>
+      <w:r>
+        <w:t>Наполнение контентом. Разбор: автор заявки сам не публикует, картинки с диска и из Figma. Чат для коробки: отдельная группа правит контент и не входит в настройки модулей. Облачные права конструктора «Публикация» и «Сайты и магазины» к этой приёмке не относятся.</w:t>
+      </w:r>
+    </w:p>
+    <w:p>
+      <w:pPr>
+        <w:pStyle w:val="ListBullet"/>
+      </w:pPr>
+      <w:r>
+        <w:t>Ошибка и личный кабинет. Разбор чинит бронь, оплату и расхождение с Macro. Чат добавляет ручную проверку: клиент А не открывает заказ или профиль клиента Б по прямой ссылке, код восстановления пароля уходит на почту и не показывается в браузере. Таких заявок в разборе нет, проверка всё равно входит в приёмку как требование чата.</w:t>
+      </w:r>
+    </w:p>
+    <w:p>
+      <w:pPr>
+        <w:pStyle w:val="ListBullet"/>
+      </w:pPr>
+      <w:r>
+        <w:t>Интеграции. Разбор: Macro, Движ, коллбэк, оплата, Метрика, TargetADS, Jivo/Mango, SIP, НДФЛКА, Полис-онлайн. Чат: вебхуки и сделка в CRM Битрикс24. В протокол входят оба контура. Сделку в CRM коробки проверяют только если реестр вебхуков её показал.</w:t>
+      </w:r>
+    </w:p>
+    <w:p>
+      <w:pPr>
+        <w:pStyle w:val="ListBullet"/>
+      </w:pPr>
+      <w:r>
+        <w:t>Доступ. После смены паролей журнал входов не показывает разработчика. Чат. Разбор про пароли в заявках говорит тем же: секрет из HD-15790 в материалы не переносили.</w:t>
+      </w:r>
+    </w:p>
+    <w:p>
+      <w:pPr>
+        <w:pStyle w:val="ListBullet"/>
+      </w:pPr>
+      <w:r>
+        <w:t>Протокол. Чат требует подписанный протокол приёмки со статусом по критичным сценариям, а не фразу «всё работает». Сценарии оплаты, входа в ЛК, коллбэка и карточки против Macro берутся из разбора. Сценарий «форма создала сделку Битрикс24» берётся из чата и выполняется только при найденной связке.</w:t>
+      </w:r>
+    </w:p>
+    <w:p>
+      <w:pPr>
+        <w:pStyle w:val="ListBullet"/>
+      </w:pPr>
+      <w:r>
+        <w:t>Оплата. Чат приводит ЮKassa и Тинькофф как примеры кабинетов эквайринга. Разбор имя кассы не называет, поэтому примеры в план как факт не попадают. Берётся другое: боевой ключ, не тестовый, и место, где смотреть лог, если деньги списались, а заказа нет.</w:t>
+      </w:r>
+    </w:p>
+    <w:p>
+      <w:pPr>
+        <w:pStyle w:val="Heading3"/>
+      </w:pPr>
+      <w:r>
+        <w:t>Первые 30 дней: лицензия и сервер</w:t>
+      </w:r>
+    </w:p>
+    <w:p>
+      <w:r>
+        <w:t>К дежурству по простою, сертификату, офисной сети и пустой выгрузке Macro чат добавляет срок жизни коробки. Лицензия, по чату, идёт 12 месяцев. Льготное продление открыто за 90 дней до конца и ещё 15 дней после. Пропуск окна чат описывает так: Маркетплейс, REST, вебхуки, облачная телефония, CRM-формы и чат-боты перестают работать. Разбор заявок этого срока не содержит. Дату всё равно записывают в первые 30 дней, если ключ коробки подтверждён.</w:t>
+      </w:r>
+    </w:p>
+    <w:p>
+      <w:r>
+        <w:t>Обновление ядра в эти 30 дней не ставят в бой в обход копии и тестовой среды. Если внешний мониторинг уже есть, алерты переводят на ЭНКО. Чат называет UptimeRobot примером такого сервиса. В разборе его нет: простои приходят заявками из офисов. Сервис из примера заводить не нужно.</w:t>
+      </w:r>
+    </w:p>
+    <w:p>
+      <w:pPr>
         <w:pStyle w:val="Heading2"/>
       </w:pPr>
       <w:r>
@@ -7599,7 +8374,7 @@
                 <w:i w:val="0"/>
                 <w:sz w:val="20"/>
               </w:rPr>
-              <w:t>Перенос</w:t>
+              <w:t>До доступа</w:t>
             </w:r>
           </w:p>
         </w:tc>
@@ -7619,7 +8394,7 @@
                 <w:i w:val="0"/>
                 <w:sz w:val="20"/>
               </w:rPr>
-              <w:t>Выбрать целевой хостинг внутри контура ЭНКО. Timeweb из HD-17803 относится к admin и lk у convis-enco.ru, не к enco.ru.</w:t>
+              <w:t>Показать, чья машина: IP, root, SSH/SFTP, панель сервера, аренда или своё железо подрядчика. Источник: чат про чужую коробку. Разбор сервер не описывает.</w:t>
             </w:r>
           </w:p>
         </w:tc>
@@ -7639,7 +8414,7 @@
                 <w:i w:val="0"/>
                 <w:sz w:val="20"/>
               </w:rPr>
-              <w:t>ЭНКО</w:t>
+              <w:t>разработчик</w:t>
             </w:r>
           </w:p>
         </w:tc>
@@ -7683,7 +8458,7 @@
                 <w:i w:val="0"/>
                 <w:sz w:val="20"/>
               </w:rPr>
-              <w:t>Перенос</w:t>
+              <w:t>До доступа</w:t>
             </w:r>
           </w:p>
         </w:tc>
@@ -7704,7 +8479,7 @@
                 <w:i w:val="0"/>
                 <w:sz w:val="20"/>
               </w:rPr>
-              <w:t>Поднять копию кода и данных в контуре. Боевая коробка разработчика в это время ещё отвечает.</w:t>
+              <w:t>Показать лицензионный ключ коробки и кабинет на 1c-bitrix.ru: ключ на ЭНКО или на подрядчике. Чат. Разбор кабинет вендора не называет.</w:t>
             </w:r>
           </w:p>
         </w:tc>
@@ -7725,7 +8500,7 @@
                 <w:i w:val="0"/>
                 <w:sz w:val="20"/>
               </w:rPr>
-              <w:t>вместе</w:t>
+              <w:t>разработчик</w:t>
             </w:r>
           </w:p>
         </w:tc>
@@ -7767,7 +8542,7 @@
                 <w:i w:val="0"/>
                 <w:sz w:val="20"/>
               </w:rPr>
-              <w:t>Перенос</w:t>
+              <w:t>До доступа</w:t>
             </w:r>
           </w:p>
         </w:tc>
@@ -7787,7 +8562,7 @@
                 <w:i w:val="0"/>
                 <w:sz w:val="20"/>
               </w:rPr>
-              <w:t>Переоформить лицензию коробки на ЭНКО до отключения коробки разработчика. Если гипотеза про Битрикс снята, пункт заменяется фактом инвентаризации.</w:t>
+              <w:t>Показать, позволяет ли лицензия загрузку исходных текстов. Чат.</w:t>
             </w:r>
           </w:p>
         </w:tc>
@@ -7807,7 +8582,7 @@
                 <w:i w:val="0"/>
                 <w:sz w:val="20"/>
               </w:rPr>
-              <w:t>вместе</w:t>
+              <w:t>разработчик</w:t>
             </w:r>
           </w:p>
         </w:tc>
@@ -7851,7 +8626,7 @@
                 <w:i w:val="0"/>
                 <w:sz w:val="20"/>
               </w:rPr>
-              <w:t>Перенос</w:t>
+              <w:t>До доступа</w:t>
             </w:r>
           </w:p>
         </w:tc>
@@ -7872,7 +8647,7 @@
                 <w:i w:val="0"/>
                 <w:sz w:val="20"/>
               </w:rPr>
-              <w:t>На копии, без смены DNS, прогнать cron, выгрузку Macro, коллбэк, блок Движ и тестовую оплату.</w:t>
+              <w:t>Отдать Git с историей коммитов, не архив. Показать, что свой код лежит в /local/, а не вперемешку с ядром в /bitrix/. Чат для коробочного Битрикс24. Разбор эти пути не называет.</w:t>
             </w:r>
           </w:p>
         </w:tc>
@@ -7893,7 +8668,7 @@
                 <w:i w:val="0"/>
                 <w:sz w:val="20"/>
               </w:rPr>
-              <w:t>вместе</w:t>
+              <w:t>разработчик</w:t>
             </w:r>
           </w:p>
         </w:tc>
@@ -7935,7 +8710,7 @@
                 <w:i w:val="0"/>
                 <w:sz w:val="20"/>
               </w:rPr>
-              <w:t>Перенос</w:t>
+              <w:t>До доступа</w:t>
             </w:r>
           </w:p>
         </w:tc>
@@ -7955,7 +8730,7 @@
                 <w:i w:val="0"/>
                 <w:sz w:val="20"/>
               </w:rPr>
-              <w:t>Проверить поддомены лендингов из офисной сети и снаружи. Симптом уже есть: HD-13847, HD-17238, HD-17284, HD-17570.</w:t>
+              <w:t>Назвать дату последнего обновления ядра. Чат считает год без обновлений красным флагом. В разборе этой даты нет.</w:t>
             </w:r>
           </w:p>
         </w:tc>
@@ -7975,7 +8750,7 @@
                 <w:i w:val="0"/>
                 <w:sz w:val="20"/>
               </w:rPr>
-              <w:t>вместе</w:t>
+              <w:t>разработчик</w:t>
             </w:r>
           </w:p>
         </w:tc>
@@ -8019,7 +8794,7 @@
                 <w:i w:val="0"/>
                 <w:sz w:val="20"/>
               </w:rPr>
-              <w:t>Перенос</w:t>
+              <w:t>До доступа</w:t>
             </w:r>
           </w:p>
         </w:tc>
@@ -8040,7 +8815,7 @@
                 <w:i w:val="0"/>
                 <w:sz w:val="20"/>
               </w:rPr>
-              <w:t>Назначить окно DNS и SSL. На окне не принимать правки контента, чтобы витрины не разъехались.</w:t>
+              <w:t>Если на коробке есть вебхуки, приложения, роботы, открытые линии или чат-боты, отдать реестр: имя, направление, чей аккаунт, права, файл сценария бота. Если нет, так и записать. Чат считает это ядром сайта. Разбор: заявка с лендинга идёт в Macro, чат Битрикс24 в HD-8205 только запасной вариант к Jivo.</w:t>
             </w:r>
           </w:p>
         </w:tc>
@@ -8061,7 +8836,7 @@
                 <w:i w:val="0"/>
                 <w:sz w:val="20"/>
               </w:rPr>
-              <w:t>ЭНКО</w:t>
+              <w:t>разработчик</w:t>
             </w:r>
           </w:p>
         </w:tc>
@@ -8103,7 +8878,7 @@
                 <w:i w:val="0"/>
                 <w:sz w:val="20"/>
               </w:rPr>
-              <w:t>Перенос</w:t>
+              <w:t>До доступа</w:t>
             </w:r>
           </w:p>
         </w:tc>
@@ -8123,7 +8898,7 @@
                 <w:i w:val="0"/>
                 <w:sz w:val="20"/>
               </w:rPr>
-              <w:t>Переключить DNS. Сразу открыть enco.ru, каталог, карточку, бронь, коллбэк с лендинга, поддомен из офиса и снаружи.</w:t>
+              <w:t>Завести тестового пользователя: правит контент и не входит в настройки модулей. Облачные права конструктора «Сайты и магазины» не применять. Разделы инфоблоков чат относит к «Управлению сайтом», не к коробке Битрикс24.</w:t>
             </w:r>
           </w:p>
         </w:tc>
@@ -8208,7 +8983,7 @@
                 <w:i w:val="0"/>
                 <w:sz w:val="20"/>
               </w:rPr>
-              <w:t>Держать откат на коробку разработчика, пока она жива. Решение вернуть DNS принимает ЭНКО.</w:t>
+              <w:t>Выбрать целевой хостинг внутри контура ЭНКО. Timeweb из HD-17803 относится к admin и lk у convis-enco.ru, не к enco.ru.</w:t>
             </w:r>
           </w:p>
         </w:tc>
@@ -8271,7 +9046,7 @@
                 <w:i w:val="0"/>
                 <w:sz w:val="20"/>
               </w:rPr>
-              <w:t>Приёмка</w:t>
+              <w:t>Перенос</w:t>
             </w:r>
           </w:p>
         </w:tc>
@@ -8291,7 +9066,7 @@
                 <w:i w:val="0"/>
                 <w:sz w:val="20"/>
               </w:rPr>
-              <w:t>Наполнение контентом без разработчика: контакт, режим офиса, оферта, плашка на лот, фото динамики, блок уже существующей презентации.</w:t>
+              <w:t>Поднять копию кода и данных в контуре. Боевая коробка разработчика в это время ещё отвечает.</w:t>
             </w:r>
           </w:p>
         </w:tc>
@@ -8311,7 +9086,7 @@
                 <w:i w:val="0"/>
                 <w:sz w:val="20"/>
               </w:rPr>
-              <w:t>ЭНКО</w:t>
+              <w:t>вместе</w:t>
             </w:r>
           </w:p>
         </w:tc>
@@ -8355,7 +9130,7 @@
                 <w:i w:val="0"/>
                 <w:sz w:val="20"/>
               </w:rPr>
-              <w:t>Приёмка</w:t>
+              <w:t>Перенос</w:t>
             </w:r>
           </w:p>
         </w:tc>
@@ -8376,7 +9151,7 @@
                 <w:i w:val="0"/>
                 <w:sz w:val="20"/>
               </w:rPr>
-              <w:t>Простой, SSL и расхождение с Macro принимает контур ЭНКО. Один внешний исполнитель больше не является очередью.</w:t>
+              <w:t>Переоформить лицензию коробки на ЭНКО до отключения коробки разработчика. Если гипотеза про Битрикс снята, пункт заменяется фактом инвентаризации.</w:t>
             </w:r>
           </w:p>
         </w:tc>
@@ -8397,7 +9172,7 @@
                 <w:i w:val="0"/>
                 <w:sz w:val="20"/>
               </w:rPr>
-              <w:t>ЭНКО</w:t>
+              <w:t>вместе</w:t>
             </w:r>
           </w:p>
         </w:tc>
@@ -8439,7 +9214,7 @@
                 <w:i w:val="0"/>
                 <w:sz w:val="20"/>
               </w:rPr>
-              <w:t>Приёмка</w:t>
+              <w:t>Перенос</w:t>
             </w:r>
           </w:p>
         </w:tc>
@@ -8459,7 +9234,7 @@
                 <w:i w:val="0"/>
                 <w:sz w:val="20"/>
               </w:rPr>
-              <w:t>Тестовая оплата брони и услуги ССК проходит на новом контуре. Сверять срок и сумму: HD-17446 дала 50 тысяч за 5 дней вместо брони на 14.</w:t>
+              <w:t>На копии, без смены DNS, прогнать cron, выгрузку Macro, коллбэк, блок Движ и тестовую оплату.</w:t>
             </w:r>
           </w:p>
         </w:tc>
@@ -8523,7 +9298,7 @@
                 <w:i w:val="0"/>
                 <w:sz w:val="20"/>
               </w:rPr>
-              <w:t>Приёмка</w:t>
+              <w:t>Перенос</w:t>
             </w:r>
           </w:p>
         </w:tc>
@@ -8544,7 +9319,7 @@
                 <w:i w:val="0"/>
                 <w:sz w:val="20"/>
               </w:rPr>
-              <w:t>Коллбэк с лендинга (образцы sonatapark.enco.ru и kazan.enco.ru) создаёт заявку в Macro.</w:t>
+              <w:t>Проверить поддомены лендингов из офисной сети и снаружи. Симптом уже есть: HD-13847, HD-17238, HD-17284, HD-17570.</w:t>
             </w:r>
           </w:p>
         </w:tc>
@@ -8607,7 +9382,7 @@
                 <w:i w:val="0"/>
                 <w:sz w:val="20"/>
               </w:rPr>
-              <w:t>Приёмка</w:t>
+              <w:t>Перенос</w:t>
             </w:r>
           </w:p>
         </w:tc>
@@ -8627,7 +9402,7 @@
                 <w:i w:val="0"/>
                 <w:sz w:val="20"/>
               </w:rPr>
-              <w:t>Блок ставок на планировке тянется из Движ, как в ответе по HD-13435.</w:t>
+              <w:t>Назначить окно DNS и SSL. На окне не принимать правки контента, чтобы витрины не разъехались.</w:t>
             </w:r>
           </w:p>
         </w:tc>
@@ -8647,7 +9422,7 @@
                 <w:i w:val="0"/>
                 <w:sz w:val="20"/>
               </w:rPr>
-              <w:t>вместе</w:t>
+              <w:t>ЭНКО</w:t>
             </w:r>
           </w:p>
         </w:tc>
@@ -8691,7 +9466,7 @@
                 <w:i w:val="0"/>
                 <w:sz w:val="20"/>
               </w:rPr>
-              <w:t>Приёмка</w:t>
+              <w:t>Перенос</w:t>
             </w:r>
           </w:p>
         </w:tc>
@@ -8712,7 +9487,7 @@
                 <w:i w:val="0"/>
                 <w:sz w:val="20"/>
               </w:rPr>
-              <w:t>Админки выданы ЭНКО. Доступы разработчика отозваны или сужены до согласованного окна.</w:t>
+              <w:t>Переключить DNS. Сразу открыть enco.ru, каталог, карточку, бронь, коллбэк с лендинга, поддомен из офиса и снаружи.</w:t>
             </w:r>
           </w:p>
         </w:tc>
@@ -8733,7 +9508,7 @@
                 <w:i w:val="0"/>
                 <w:sz w:val="20"/>
               </w:rPr>
-              <w:t>ЭНКО</w:t>
+              <w:t>вместе</w:t>
             </w:r>
           </w:p>
         </w:tc>
@@ -8775,7 +9550,7 @@
                 <w:i w:val="0"/>
                 <w:sz w:val="20"/>
               </w:rPr>
-              <w:t>Приёмка</w:t>
+              <w:t>Перенос</w:t>
             </w:r>
           </w:p>
         </w:tc>
@@ -8795,7 +9570,7 @@
                 <w:i w:val="0"/>
                 <w:sz w:val="20"/>
               </w:rPr>
-              <w:t>Доработка и улучшение идут отдельно от наполнения. 99 заявок «Перенесено в проект» не считаются сделанными и не растворяются в поддержке.</w:t>
+              <w:t>Держать откат на коробку разработчика, пока она жива. Решение вернуть DNS принимает ЭНКО.</w:t>
             </w:r>
           </w:p>
         </w:tc>
@@ -8859,7 +9634,7 @@
                 <w:i w:val="0"/>
                 <w:sz w:val="20"/>
               </w:rPr>
-              <w:t>Приёмка</w:t>
+              <w:t>Перенос</w:t>
             </w:r>
           </w:p>
         </w:tc>
@@ -8880,7 +9655,7 @@
                 <w:i w:val="0"/>
                 <w:sz w:val="20"/>
               </w:rPr>
-              <w:t>Консультация закрывается ответом без выкладки. Заявка, из которой не восстановить действие, в работу витрины не берётся.</w:t>
+              <w:t>Перепривязать ключ на аккаунт ЭНКО и убрать лицензию из кабинета подрядчика до отключения его сервера. Чат.</w:t>
             </w:r>
           </w:p>
         </w:tc>
@@ -8901,7 +9676,7 @@
                 <w:i w:val="0"/>
                 <w:sz w:val="20"/>
               </w:rPr>
-              <w:t>ЭНКО</w:t>
+              <w:t>вместе</w:t>
             </w:r>
           </w:p>
         </w:tc>
@@ -8943,7 +9718,7 @@
                 <w:i w:val="0"/>
                 <w:sz w:val="20"/>
               </w:rPr>
-              <w:t>30 дней</w:t>
+              <w:t>Перенос</w:t>
             </w:r>
           </w:p>
         </w:tc>
@@ -8963,7 +9738,7 @@
                 <w:i w:val="0"/>
                 <w:sz w:val="20"/>
               </w:rPr>
-              <w:t>Дежурство на простой, сертификат, поддомены из офиса и пустую ночную выгрузку Macro.</w:t>
+              <w:t>Снять дамп базы и архив файлов и развернуть их на тестовой среде. «Бэкап делает хостинг» без прогона не считается. Чат добавляет проверку восстановления к бэкапам из разбора.</w:t>
             </w:r>
           </w:p>
         </w:tc>
@@ -8983,7 +9758,7 @@
                 <w:i w:val="0"/>
                 <w:sz w:val="20"/>
               </w:rPr>
-              <w:t>ЭНКО</w:t>
+              <w:t>вместе</w:t>
             </w:r>
           </w:p>
         </w:tc>
@@ -9027,7 +9802,7 @@
                 <w:i w:val="0"/>
                 <w:sz w:val="20"/>
               </w:rPr>
-              <w:t>30 дней</w:t>
+              <w:t>Перенос</w:t>
             </w:r>
           </w:p>
         </w:tc>
@@ -9048,7 +9823,7 @@
                 <w:i w:val="0"/>
                 <w:sz w:val="20"/>
               </w:rPr>
-              <w:t>Один простой или одна редактура документа — одна заявка. Повтор связывают. Исторические копии пачкой не переносить.</w:t>
+              <w:t>Сменить пароль root ОС и MySQL, проверить authorized_keys и лишних пользователей базы, просмотреть crontab на обращения к серверам подрядчика. Чат.</w:t>
             </w:r>
           </w:p>
         </w:tc>
@@ -9069,7 +9844,7 @@
                 <w:i w:val="0"/>
                 <w:sz w:val="20"/>
               </w:rPr>
-              <w:t>ЭНКО</w:t>
+              <w:t>вместе</w:t>
             </w:r>
           </w:p>
         </w:tc>
@@ -9111,7 +9886,7 @@
                 <w:i w:val="0"/>
                 <w:sz w:val="20"/>
               </w:rPr>
-              <w:t>30 дней</w:t>
+              <w:t>Перенос</w:t>
             </w:r>
           </w:p>
         </w:tc>
@@ -9131,7 +9906,7 @@
                 <w:i w:val="0"/>
                 <w:sz w:val="20"/>
               </w:rPr>
-              <w:t>В категорию сайтов не заводить портал, вики, Mindbox и топливные карты. Смешанную заявку помечать: какая половина про витрину.</w:t>
+              <w:t>Не выкладывать обновление ядра ручным FTP в бой: сначала копия, потом тестовая среда, потом продуктив. Чат. Имена стендов, кроме enco.ru/promocalc/, называет разработчик.</w:t>
             </w:r>
           </w:p>
         </w:tc>
@@ -9195,7 +9970,7 @@
                 <w:i w:val="0"/>
                 <w:sz w:val="20"/>
               </w:rPr>
-              <w:t>30 дней</w:t>
+              <w:t>Приёмка</w:t>
             </w:r>
           </w:p>
         </w:tc>
@@ -9216,7 +9991,7 @@
                 <w:i w:val="0"/>
                 <w:sz w:val="20"/>
               </w:rPr>
-              <w:t>Авторы контента публикуют сами или через роль внутри ЭНКО. Замена текста больше не ждёт разработчика коробки.</w:t>
+              <w:t>Наполнение контентом без разработчика: контакт, режим офиса, оферта, плашка на лот, фото динамики, блок уже существующей презентации.</w:t>
             </w:r>
           </w:p>
         </w:tc>
@@ -9279,7 +10054,7 @@
                 <w:i w:val="0"/>
                 <w:sz w:val="20"/>
               </w:rPr>
-              <w:t>30 дней</w:t>
+              <w:t>Приёмка</w:t>
             </w:r>
           </w:p>
         </w:tc>
@@ -9299,7 +10074,7 @@
                 <w:i w:val="0"/>
                 <w:sz w:val="20"/>
               </w:rPr>
-              <w:t>Открытый хвост: в разборе по имени «в процессе» указана HD-15790 (Полис-онлайн). Остальные пять ключей в тексте не названы — выгрузить заново и оставить только витрину.</w:t>
+              <w:t>Простой, SSL и расхождение с Macro принимает контур ЭНКО. Один внешний исполнитель больше не является очередью.</w:t>
             </w:r>
           </w:p>
         </w:tc>
@@ -9319,7 +10094,7 @@
                 <w:i w:val="0"/>
                 <w:sz w:val="20"/>
               </w:rPr>
-              <w:t>вместе</w:t>
+              <w:t>ЭНКО</w:t>
             </w:r>
           </w:p>
         </w:tc>
@@ -9363,7 +10138,7 @@
                 <w:i w:val="0"/>
                 <w:sz w:val="20"/>
               </w:rPr>
-              <w:t>30 дней</w:t>
+              <w:t>Приёмка</w:t>
             </w:r>
           </w:p>
         </w:tc>
@@ -9384,7 +10159,7 @@
                 <w:i w:val="0"/>
                 <w:sz w:val="20"/>
               </w:rPr>
-              <w:t>На Macro, Движ, коллбэк и оплату записать владельца внутри ЭНКО.</w:t>
+              <w:t>Тестовая оплата брони и услуги ССК проходит на новом контуре. Сверять срок и сумму: HD-17446 дала 50 тысяч за 5 дней вместо брони на 14.</w:t>
             </w:r>
           </w:p>
         </w:tc>
@@ -9405,7 +10180,7 @@
                 <w:i w:val="0"/>
                 <w:sz w:val="20"/>
               </w:rPr>
-              <w:t>ЭНКО</w:t>
+              <w:t>вместе</w:t>
             </w:r>
           </w:p>
         </w:tc>
@@ -9447,7 +10222,7 @@
                 <w:i w:val="0"/>
                 <w:sz w:val="20"/>
               </w:rPr>
-              <w:t>30 дней</w:t>
+              <w:t>Приёмка</w:t>
             </w:r>
           </w:p>
         </w:tc>
@@ -9467,7 +10242,7 @@
                 <w:i w:val="0"/>
                 <w:sz w:val="20"/>
               </w:rPr>
-              <w:t>Отдельным решением закрыть судьбу tender-enco72.ru и convis-enco.ru. К переносу продающей витрины их не пристёгивать.</w:t>
+              <w:t>Коллбэк с лендинга (образцы sonatapark.enco.ru и kazan.enco.ru) создаёт заявку в Macro.</w:t>
             </w:r>
           </w:p>
         </w:tc>
@@ -9487,7 +10262,7 @@
                 <w:i w:val="0"/>
                 <w:sz w:val="20"/>
               </w:rPr>
-              <w:t>ЭНКО</w:t>
+              <w:t>вместе</w:t>
             </w:r>
           </w:p>
         </w:tc>
@@ -9531,7 +10306,7 @@
                 <w:i w:val="0"/>
                 <w:sz w:val="20"/>
               </w:rPr>
-              <w:t>30 дней</w:t>
+              <w:t>Приёмка</w:t>
             </w:r>
           </w:p>
         </w:tc>
@@ -9552,7 +10327,7 @@
                 <w:i w:val="0"/>
                 <w:sz w:val="20"/>
               </w:rPr>
-              <w:t>На 30-й день проверить, что новые заявки ложатся в восемь тем разбора. Тип Jira со смыслом в выгрузке не совпадал.</w:t>
+              <w:t>Блок ставок на планировке тянется из Движ, как в ответе по HD-13435.</w:t>
             </w:r>
           </w:p>
         </w:tc>
@@ -9560,6 +10335,1600 @@
           <w:tcPr>
             <w:tcW w:type="dxa" w:w="1474"/>
             <w:shd w:val="clear" w:color="auto" w:fill="F7F4EE"/>
+            <w:vAlign w:val="top"/>
+          </w:tcPr>
+          <w:p>
+            <w:pPr>
+              <w:spacing w:after="40" w:before="40"/>
+            </w:pPr>
+            <w:r>
+              <w:rPr>
+                <w:rFonts w:ascii="Calibri" w:hAnsi="Calibri" w:eastAsia="Calibri"/>
+                <w:b/>
+                <w:i w:val="0"/>
+                <w:sz w:val="20"/>
+              </w:rPr>
+              <w:t>вместе</w:t>
+            </w:r>
+          </w:p>
+        </w:tc>
+      </w:tr>
+      <w:tr>
+        <w:tc>
+          <w:tcPr>
+            <w:tcW w:type="dxa" w:w="680"/>
+            <w:vAlign w:val="top"/>
+          </w:tcPr>
+          <w:p>
+            <w:pPr>
+              <w:spacing w:after="40" w:before="40"/>
+            </w:pPr>
+            <w:r>
+              <w:rPr>
+                <w:rFonts w:ascii="Calibri" w:hAnsi="Calibri" w:eastAsia="Calibri"/>
+                <w:b w:val="0"/>
+                <w:i w:val="0"/>
+                <w:sz w:val="20"/>
+              </w:rPr>
+              <w:t>39</w:t>
+            </w:r>
+          </w:p>
+        </w:tc>
+        <w:tc>
+          <w:tcPr>
+            <w:tcW w:type="dxa" w:w="1474"/>
+            <w:vAlign w:val="top"/>
+          </w:tcPr>
+          <w:p>
+            <w:pPr>
+              <w:spacing w:after="40" w:before="40"/>
+            </w:pPr>
+            <w:r>
+              <w:rPr>
+                <w:rFonts w:ascii="Calibri" w:hAnsi="Calibri" w:eastAsia="Calibri"/>
+                <w:b w:val="0"/>
+                <w:i w:val="0"/>
+                <w:sz w:val="20"/>
+              </w:rPr>
+              <w:t>Приёмка</w:t>
+            </w:r>
+          </w:p>
+        </w:tc>
+        <w:tc>
+          <w:tcPr>
+            <w:tcW w:type="dxa" w:w="6350"/>
+            <w:vAlign w:val="top"/>
+          </w:tcPr>
+          <w:p>
+            <w:pPr>
+              <w:spacing w:after="40" w:before="40"/>
+            </w:pPr>
+            <w:r>
+              <w:rPr>
+                <w:rFonts w:ascii="Calibri" w:hAnsi="Calibri" w:eastAsia="Calibri"/>
+                <w:b w:val="0"/>
+                <w:i w:val="0"/>
+                <w:sz w:val="20"/>
+              </w:rPr>
+              <w:t>Админки выданы ЭНКО. Доступы разработчика отозваны или сужены до согласованного окна.</w:t>
+            </w:r>
+          </w:p>
+        </w:tc>
+        <w:tc>
+          <w:tcPr>
+            <w:tcW w:type="dxa" w:w="1474"/>
+            <w:vAlign w:val="top"/>
+          </w:tcPr>
+          <w:p>
+            <w:pPr>
+              <w:spacing w:after="40" w:before="40"/>
+            </w:pPr>
+            <w:r>
+              <w:rPr>
+                <w:rFonts w:ascii="Calibri" w:hAnsi="Calibri" w:eastAsia="Calibri"/>
+                <w:b/>
+                <w:i w:val="0"/>
+                <w:sz w:val="20"/>
+              </w:rPr>
+              <w:t>ЭНКО</w:t>
+            </w:r>
+          </w:p>
+        </w:tc>
+      </w:tr>
+      <w:tr>
+        <w:tc>
+          <w:tcPr>
+            <w:tcW w:type="dxa" w:w="680"/>
+            <w:shd w:val="clear" w:color="auto" w:fill="F7F4EE"/>
+            <w:vAlign w:val="top"/>
+          </w:tcPr>
+          <w:p>
+            <w:pPr>
+              <w:spacing w:after="40" w:before="40"/>
+            </w:pPr>
+            <w:r>
+              <w:rPr>
+                <w:rFonts w:ascii="Calibri" w:hAnsi="Calibri" w:eastAsia="Calibri"/>
+                <w:b w:val="0"/>
+                <w:i w:val="0"/>
+                <w:sz w:val="20"/>
+              </w:rPr>
+              <w:t>40</w:t>
+            </w:r>
+          </w:p>
+        </w:tc>
+        <w:tc>
+          <w:tcPr>
+            <w:tcW w:type="dxa" w:w="1474"/>
+            <w:shd w:val="clear" w:color="auto" w:fill="F7F4EE"/>
+            <w:vAlign w:val="top"/>
+          </w:tcPr>
+          <w:p>
+            <w:pPr>
+              <w:spacing w:after="40" w:before="40"/>
+            </w:pPr>
+            <w:r>
+              <w:rPr>
+                <w:rFonts w:ascii="Calibri" w:hAnsi="Calibri" w:eastAsia="Calibri"/>
+                <w:b w:val="0"/>
+                <w:i w:val="0"/>
+                <w:sz w:val="20"/>
+              </w:rPr>
+              <w:t>Приёмка</w:t>
+            </w:r>
+          </w:p>
+        </w:tc>
+        <w:tc>
+          <w:tcPr>
+            <w:tcW w:type="dxa" w:w="6350"/>
+            <w:shd w:val="clear" w:color="auto" w:fill="F7F4EE"/>
+            <w:vAlign w:val="top"/>
+          </w:tcPr>
+          <w:p>
+            <w:pPr>
+              <w:spacing w:after="40" w:before="40"/>
+            </w:pPr>
+            <w:r>
+              <w:rPr>
+                <w:rFonts w:ascii="Calibri" w:hAnsi="Calibri" w:eastAsia="Calibri"/>
+                <w:b w:val="0"/>
+                <w:i w:val="0"/>
+                <w:sz w:val="20"/>
+              </w:rPr>
+              <w:t>Доработка и улучшение идут отдельно от наполнения. 99 заявок «Перенесено в проект» не считаются сделанными и не растворяются в поддержке.</w:t>
+            </w:r>
+          </w:p>
+        </w:tc>
+        <w:tc>
+          <w:tcPr>
+            <w:tcW w:type="dxa" w:w="1474"/>
+            <w:shd w:val="clear" w:color="auto" w:fill="F7F4EE"/>
+            <w:vAlign w:val="top"/>
+          </w:tcPr>
+          <w:p>
+            <w:pPr>
+              <w:spacing w:after="40" w:before="40"/>
+            </w:pPr>
+            <w:r>
+              <w:rPr>
+                <w:rFonts w:ascii="Calibri" w:hAnsi="Calibri" w:eastAsia="Calibri"/>
+                <w:b/>
+                <w:i w:val="0"/>
+                <w:sz w:val="20"/>
+              </w:rPr>
+              <w:t>ЭНКО</w:t>
+            </w:r>
+          </w:p>
+        </w:tc>
+      </w:tr>
+      <w:tr>
+        <w:tc>
+          <w:tcPr>
+            <w:tcW w:type="dxa" w:w="680"/>
+            <w:vAlign w:val="top"/>
+          </w:tcPr>
+          <w:p>
+            <w:pPr>
+              <w:spacing w:after="40" w:before="40"/>
+            </w:pPr>
+            <w:r>
+              <w:rPr>
+                <w:rFonts w:ascii="Calibri" w:hAnsi="Calibri" w:eastAsia="Calibri"/>
+                <w:b w:val="0"/>
+                <w:i w:val="0"/>
+                <w:sz w:val="20"/>
+              </w:rPr>
+              <w:t>41</w:t>
+            </w:r>
+          </w:p>
+        </w:tc>
+        <w:tc>
+          <w:tcPr>
+            <w:tcW w:type="dxa" w:w="1474"/>
+            <w:vAlign w:val="top"/>
+          </w:tcPr>
+          <w:p>
+            <w:pPr>
+              <w:spacing w:after="40" w:before="40"/>
+            </w:pPr>
+            <w:r>
+              <w:rPr>
+                <w:rFonts w:ascii="Calibri" w:hAnsi="Calibri" w:eastAsia="Calibri"/>
+                <w:b w:val="0"/>
+                <w:i w:val="0"/>
+                <w:sz w:val="20"/>
+              </w:rPr>
+              <w:t>Приёмка</w:t>
+            </w:r>
+          </w:p>
+        </w:tc>
+        <w:tc>
+          <w:tcPr>
+            <w:tcW w:type="dxa" w:w="6350"/>
+            <w:vAlign w:val="top"/>
+          </w:tcPr>
+          <w:p>
+            <w:pPr>
+              <w:spacing w:after="40" w:before="40"/>
+            </w:pPr>
+            <w:r>
+              <w:rPr>
+                <w:rFonts w:ascii="Calibri" w:hAnsi="Calibri" w:eastAsia="Calibri"/>
+                <w:b w:val="0"/>
+                <w:i w:val="0"/>
+                <w:sz w:val="20"/>
+              </w:rPr>
+              <w:t>Консультация закрывается ответом без выкладки. Заявка, из которой не восстановить действие, в работу витрины не берётся.</w:t>
+            </w:r>
+          </w:p>
+        </w:tc>
+        <w:tc>
+          <w:tcPr>
+            <w:tcW w:type="dxa" w:w="1474"/>
+            <w:vAlign w:val="top"/>
+          </w:tcPr>
+          <w:p>
+            <w:pPr>
+              <w:spacing w:after="40" w:before="40"/>
+            </w:pPr>
+            <w:r>
+              <w:rPr>
+                <w:rFonts w:ascii="Calibri" w:hAnsi="Calibri" w:eastAsia="Calibri"/>
+                <w:b/>
+                <w:i w:val="0"/>
+                <w:sz w:val="20"/>
+              </w:rPr>
+              <w:t>ЭНКО</w:t>
+            </w:r>
+          </w:p>
+        </w:tc>
+      </w:tr>
+      <w:tr>
+        <w:tc>
+          <w:tcPr>
+            <w:tcW w:type="dxa" w:w="680"/>
+            <w:shd w:val="clear" w:color="auto" w:fill="F7F4EE"/>
+            <w:vAlign w:val="top"/>
+          </w:tcPr>
+          <w:p>
+            <w:pPr>
+              <w:spacing w:after="40" w:before="40"/>
+            </w:pPr>
+            <w:r>
+              <w:rPr>
+                <w:rFonts w:ascii="Calibri" w:hAnsi="Calibri" w:eastAsia="Calibri"/>
+                <w:b w:val="0"/>
+                <w:i w:val="0"/>
+                <w:sz w:val="20"/>
+              </w:rPr>
+              <w:t>42</w:t>
+            </w:r>
+          </w:p>
+        </w:tc>
+        <w:tc>
+          <w:tcPr>
+            <w:tcW w:type="dxa" w:w="1474"/>
+            <w:shd w:val="clear" w:color="auto" w:fill="F7F4EE"/>
+            <w:vAlign w:val="top"/>
+          </w:tcPr>
+          <w:p>
+            <w:pPr>
+              <w:spacing w:after="40" w:before="40"/>
+            </w:pPr>
+            <w:r>
+              <w:rPr>
+                <w:rFonts w:ascii="Calibri" w:hAnsi="Calibri" w:eastAsia="Calibri"/>
+                <w:b w:val="0"/>
+                <w:i w:val="0"/>
+                <w:sz w:val="20"/>
+              </w:rPr>
+              <w:t>Приёмка</w:t>
+            </w:r>
+          </w:p>
+        </w:tc>
+        <w:tc>
+          <w:tcPr>
+            <w:tcW w:type="dxa" w:w="6350"/>
+            <w:shd w:val="clear" w:color="auto" w:fill="F7F4EE"/>
+            <w:vAlign w:val="top"/>
+          </w:tcPr>
+          <w:p>
+            <w:pPr>
+              <w:spacing w:after="40" w:before="40"/>
+            </w:pPr>
+            <w:r>
+              <w:rPr>
+                <w:rFonts w:ascii="Calibri" w:hAnsi="Calibri" w:eastAsia="Calibri"/>
+                <w:b w:val="0"/>
+                <w:i w:val="0"/>
+                <w:sz w:val="20"/>
+              </w:rPr>
+              <w:t>Редактор контента меняет страницу и не открывает настройки модулей. Чат описывает это как группы коробки. Разбор: сегодня контент кладут заявкой, не руками автора.</w:t>
+            </w:r>
+          </w:p>
+        </w:tc>
+        <w:tc>
+          <w:tcPr>
+            <w:tcW w:type="dxa" w:w="1474"/>
+            <w:shd w:val="clear" w:color="auto" w:fill="F7F4EE"/>
+            <w:vAlign w:val="top"/>
+          </w:tcPr>
+          <w:p>
+            <w:pPr>
+              <w:spacing w:after="40" w:before="40"/>
+            </w:pPr>
+            <w:r>
+              <w:rPr>
+                <w:rFonts w:ascii="Calibri" w:hAnsi="Calibri" w:eastAsia="Calibri"/>
+                <w:b/>
+                <w:i w:val="0"/>
+                <w:sz w:val="20"/>
+              </w:rPr>
+              <w:t>ЭНКО</w:t>
+            </w:r>
+          </w:p>
+        </w:tc>
+      </w:tr>
+      <w:tr>
+        <w:tc>
+          <w:tcPr>
+            <w:tcW w:type="dxa" w:w="680"/>
+            <w:vAlign w:val="top"/>
+          </w:tcPr>
+          <w:p>
+            <w:pPr>
+              <w:spacing w:after="40" w:before="40"/>
+            </w:pPr>
+            <w:r>
+              <w:rPr>
+                <w:rFonts w:ascii="Calibri" w:hAnsi="Calibri" w:eastAsia="Calibri"/>
+                <w:b w:val="0"/>
+                <w:i w:val="0"/>
+                <w:sz w:val="20"/>
+              </w:rPr>
+              <w:t>43</w:t>
+            </w:r>
+          </w:p>
+        </w:tc>
+        <w:tc>
+          <w:tcPr>
+            <w:tcW w:type="dxa" w:w="1474"/>
+            <w:vAlign w:val="top"/>
+          </w:tcPr>
+          <w:p>
+            <w:pPr>
+              <w:spacing w:after="40" w:before="40"/>
+            </w:pPr>
+            <w:r>
+              <w:rPr>
+                <w:rFonts w:ascii="Calibri" w:hAnsi="Calibri" w:eastAsia="Calibri"/>
+                <w:b w:val="0"/>
+                <w:i w:val="0"/>
+                <w:sz w:val="20"/>
+              </w:rPr>
+              <w:t>Приёмка</w:t>
+            </w:r>
+          </w:p>
+        </w:tc>
+        <w:tc>
+          <w:tcPr>
+            <w:tcW w:type="dxa" w:w="6350"/>
+            <w:vAlign w:val="top"/>
+          </w:tcPr>
+          <w:p>
+            <w:pPr>
+              <w:spacing w:after="40" w:before="40"/>
+            </w:pPr>
+            <w:r>
+              <w:rPr>
+                <w:rFonts w:ascii="Calibri" w:hAnsi="Calibri" w:eastAsia="Calibri"/>
+                <w:b w:val="0"/>
+                <w:i w:val="0"/>
+                <w:sz w:val="20"/>
+              </w:rPr>
+              <w:t>Клиент А не открывает заказ или профиль клиента Б по прямой ссылке. Код восстановления пароля ЛК уходит на почту и не показывается в браузере. Чат. В разборе таких проверок нет.</w:t>
+            </w:r>
+          </w:p>
+        </w:tc>
+        <w:tc>
+          <w:tcPr>
+            <w:tcW w:type="dxa" w:w="1474"/>
+            <w:vAlign w:val="top"/>
+          </w:tcPr>
+          <w:p>
+            <w:pPr>
+              <w:spacing w:after="40" w:before="40"/>
+            </w:pPr>
+            <w:r>
+              <w:rPr>
+                <w:rFonts w:ascii="Calibri" w:hAnsi="Calibri" w:eastAsia="Calibri"/>
+                <w:b/>
+                <w:i w:val="0"/>
+                <w:sz w:val="20"/>
+              </w:rPr>
+              <w:t>вместе</w:t>
+            </w:r>
+          </w:p>
+        </w:tc>
+      </w:tr>
+      <w:tr>
+        <w:tc>
+          <w:tcPr>
+            <w:tcW w:type="dxa" w:w="680"/>
+            <w:shd w:val="clear" w:color="auto" w:fill="F7F4EE"/>
+            <w:vAlign w:val="top"/>
+          </w:tcPr>
+          <w:p>
+            <w:pPr>
+              <w:spacing w:after="40" w:before="40"/>
+            </w:pPr>
+            <w:r>
+              <w:rPr>
+                <w:rFonts w:ascii="Calibri" w:hAnsi="Calibri" w:eastAsia="Calibri"/>
+                <w:b w:val="0"/>
+                <w:i w:val="0"/>
+                <w:sz w:val="20"/>
+              </w:rPr>
+              <w:t>44</w:t>
+            </w:r>
+          </w:p>
+        </w:tc>
+        <w:tc>
+          <w:tcPr>
+            <w:tcW w:type="dxa" w:w="1474"/>
+            <w:shd w:val="clear" w:color="auto" w:fill="F7F4EE"/>
+            <w:vAlign w:val="top"/>
+          </w:tcPr>
+          <w:p>
+            <w:pPr>
+              <w:spacing w:after="40" w:before="40"/>
+            </w:pPr>
+            <w:r>
+              <w:rPr>
+                <w:rFonts w:ascii="Calibri" w:hAnsi="Calibri" w:eastAsia="Calibri"/>
+                <w:b w:val="0"/>
+                <w:i w:val="0"/>
+                <w:sz w:val="20"/>
+              </w:rPr>
+              <w:t>Приёмка</w:t>
+            </w:r>
+          </w:p>
+        </w:tc>
+        <w:tc>
+          <w:tcPr>
+            <w:tcW w:type="dxa" w:w="6350"/>
+            <w:shd w:val="clear" w:color="auto" w:fill="F7F4EE"/>
+            <w:vAlign w:val="top"/>
+          </w:tcPr>
+          <w:p>
+            <w:pPr>
+              <w:spacing w:after="40" w:before="40"/>
+            </w:pPr>
+            <w:r>
+              <w:rPr>
+                <w:rFonts w:ascii="Calibri" w:hAnsi="Calibri" w:eastAsia="Calibri"/>
+                <w:b w:val="0"/>
+                <w:i w:val="0"/>
+                <w:sz w:val="20"/>
+              </w:rPr>
+              <w:t>Журнал входов: после смены паролей входов разработчика нет. Чат.</w:t>
+            </w:r>
+          </w:p>
+        </w:tc>
+        <w:tc>
+          <w:tcPr>
+            <w:tcW w:type="dxa" w:w="1474"/>
+            <w:shd w:val="clear" w:color="auto" w:fill="F7F4EE"/>
+            <w:vAlign w:val="top"/>
+          </w:tcPr>
+          <w:p>
+            <w:pPr>
+              <w:spacing w:after="40" w:before="40"/>
+            </w:pPr>
+            <w:r>
+              <w:rPr>
+                <w:rFonts w:ascii="Calibri" w:hAnsi="Calibri" w:eastAsia="Calibri"/>
+                <w:b/>
+                <w:i w:val="0"/>
+                <w:sz w:val="20"/>
+              </w:rPr>
+              <w:t>ЭНКО</w:t>
+            </w:r>
+          </w:p>
+        </w:tc>
+      </w:tr>
+      <w:tr>
+        <w:tc>
+          <w:tcPr>
+            <w:tcW w:type="dxa" w:w="680"/>
+            <w:vAlign w:val="top"/>
+          </w:tcPr>
+          <w:p>
+            <w:pPr>
+              <w:spacing w:after="40" w:before="40"/>
+            </w:pPr>
+            <w:r>
+              <w:rPr>
+                <w:rFonts w:ascii="Calibri" w:hAnsi="Calibri" w:eastAsia="Calibri"/>
+                <w:b w:val="0"/>
+                <w:i w:val="0"/>
+                <w:sz w:val="20"/>
+              </w:rPr>
+              <w:t>45</w:t>
+            </w:r>
+          </w:p>
+        </w:tc>
+        <w:tc>
+          <w:tcPr>
+            <w:tcW w:type="dxa" w:w="1474"/>
+            <w:vAlign w:val="top"/>
+          </w:tcPr>
+          <w:p>
+            <w:pPr>
+              <w:spacing w:after="40" w:before="40"/>
+            </w:pPr>
+            <w:r>
+              <w:rPr>
+                <w:rFonts w:ascii="Calibri" w:hAnsi="Calibri" w:eastAsia="Calibri"/>
+                <w:b w:val="0"/>
+                <w:i w:val="0"/>
+                <w:sz w:val="20"/>
+              </w:rPr>
+              <w:t>Приёмка</w:t>
+            </w:r>
+          </w:p>
+        </w:tc>
+        <w:tc>
+          <w:tcPr>
+            <w:tcW w:type="dxa" w:w="6350"/>
+            <w:vAlign w:val="top"/>
+          </w:tcPr>
+          <w:p>
+            <w:pPr>
+              <w:spacing w:after="40" w:before="40"/>
+            </w:pPr>
+            <w:r>
+              <w:rPr>
+                <w:rFonts w:ascii="Calibri" w:hAnsi="Calibri" w:eastAsia="Calibri"/>
+                <w:b w:val="0"/>
+                <w:i w:val="0"/>
+                <w:sz w:val="20"/>
+              </w:rPr>
+              <w:t>Короткий протокол с подписью: оплата брони, вход в ЛК, коллбэк в Macro, карточка против Macro. Чат ещё ждёт сделку в CRM Битрикс24. Её проверяют только если реестр вебхуков показал такую связку.</w:t>
+            </w:r>
+          </w:p>
+        </w:tc>
+        <w:tc>
+          <w:tcPr>
+            <w:tcW w:type="dxa" w:w="1474"/>
+            <w:vAlign w:val="top"/>
+          </w:tcPr>
+          <w:p>
+            <w:pPr>
+              <w:spacing w:after="40" w:before="40"/>
+            </w:pPr>
+            <w:r>
+              <w:rPr>
+                <w:rFonts w:ascii="Calibri" w:hAnsi="Calibri" w:eastAsia="Calibri"/>
+                <w:b/>
+                <w:i w:val="0"/>
+                <w:sz w:val="20"/>
+              </w:rPr>
+              <w:t>вместе</w:t>
+            </w:r>
+          </w:p>
+        </w:tc>
+      </w:tr>
+      <w:tr>
+        <w:tc>
+          <w:tcPr>
+            <w:tcW w:type="dxa" w:w="680"/>
+            <w:shd w:val="clear" w:color="auto" w:fill="F7F4EE"/>
+            <w:vAlign w:val="top"/>
+          </w:tcPr>
+          <w:p>
+            <w:pPr>
+              <w:spacing w:after="40" w:before="40"/>
+            </w:pPr>
+            <w:r>
+              <w:rPr>
+                <w:rFonts w:ascii="Calibri" w:hAnsi="Calibri" w:eastAsia="Calibri"/>
+                <w:b w:val="0"/>
+                <w:i w:val="0"/>
+                <w:sz w:val="20"/>
+              </w:rPr>
+              <w:t>46</w:t>
+            </w:r>
+          </w:p>
+        </w:tc>
+        <w:tc>
+          <w:tcPr>
+            <w:tcW w:type="dxa" w:w="1474"/>
+            <w:shd w:val="clear" w:color="auto" w:fill="F7F4EE"/>
+            <w:vAlign w:val="top"/>
+          </w:tcPr>
+          <w:p>
+            <w:pPr>
+              <w:spacing w:after="40" w:before="40"/>
+            </w:pPr>
+            <w:r>
+              <w:rPr>
+                <w:rFonts w:ascii="Calibri" w:hAnsi="Calibri" w:eastAsia="Calibri"/>
+                <w:b w:val="0"/>
+                <w:i w:val="0"/>
+                <w:sz w:val="20"/>
+              </w:rPr>
+              <w:t>Приёмка</w:t>
+            </w:r>
+          </w:p>
+        </w:tc>
+        <w:tc>
+          <w:tcPr>
+            <w:tcW w:type="dxa" w:w="6350"/>
+            <w:shd w:val="clear" w:color="auto" w:fill="F7F4EE"/>
+            <w:vAlign w:val="top"/>
+          </w:tcPr>
+          <w:p>
+            <w:pPr>
+              <w:spacing w:after="40" w:before="40"/>
+            </w:pPr>
+            <w:r>
+              <w:rPr>
+                <w:rFonts w:ascii="Calibri" w:hAnsi="Calibri" w:eastAsia="Calibri"/>
+                <w:b w:val="0"/>
+                <w:i w:val="0"/>
+                <w:sz w:val="20"/>
+              </w:rPr>
+              <w:t>Вебхуки коробки, если они есть, пересозданы на аккаунте ЭНКО. Если их нет, в протоколе стоит «не найдены». Боевой ключ оплаты, не тестовый, и место лога, если деньги списались, а заказа нет. ЮKassa и Тинькофф в чате — примеры, не касса ЭНКО.</w:t>
+            </w:r>
+          </w:p>
+        </w:tc>
+        <w:tc>
+          <w:tcPr>
+            <w:tcW w:type="dxa" w:w="1474"/>
+            <w:shd w:val="clear" w:color="auto" w:fill="F7F4EE"/>
+            <w:vAlign w:val="top"/>
+          </w:tcPr>
+          <w:p>
+            <w:pPr>
+              <w:spacing w:after="40" w:before="40"/>
+            </w:pPr>
+            <w:r>
+              <w:rPr>
+                <w:rFonts w:ascii="Calibri" w:hAnsi="Calibri" w:eastAsia="Calibri"/>
+                <w:b/>
+                <w:i w:val="0"/>
+                <w:sz w:val="20"/>
+              </w:rPr>
+              <w:t>вместе</w:t>
+            </w:r>
+          </w:p>
+        </w:tc>
+      </w:tr>
+      <w:tr>
+        <w:tc>
+          <w:tcPr>
+            <w:tcW w:type="dxa" w:w="680"/>
+            <w:vAlign w:val="top"/>
+          </w:tcPr>
+          <w:p>
+            <w:pPr>
+              <w:spacing w:after="40" w:before="40"/>
+            </w:pPr>
+            <w:r>
+              <w:rPr>
+                <w:rFonts w:ascii="Calibri" w:hAnsi="Calibri" w:eastAsia="Calibri"/>
+                <w:b w:val="0"/>
+                <w:i w:val="0"/>
+                <w:sz w:val="20"/>
+              </w:rPr>
+              <w:t>47</w:t>
+            </w:r>
+          </w:p>
+        </w:tc>
+        <w:tc>
+          <w:tcPr>
+            <w:tcW w:type="dxa" w:w="1474"/>
+            <w:vAlign w:val="top"/>
+          </w:tcPr>
+          <w:p>
+            <w:pPr>
+              <w:spacing w:after="40" w:before="40"/>
+            </w:pPr>
+            <w:r>
+              <w:rPr>
+                <w:rFonts w:ascii="Calibri" w:hAnsi="Calibri" w:eastAsia="Calibri"/>
+                <w:b w:val="0"/>
+                <w:i w:val="0"/>
+                <w:sz w:val="20"/>
+              </w:rPr>
+              <w:t>30 дней</w:t>
+            </w:r>
+          </w:p>
+        </w:tc>
+        <w:tc>
+          <w:tcPr>
+            <w:tcW w:type="dxa" w:w="6350"/>
+            <w:vAlign w:val="top"/>
+          </w:tcPr>
+          <w:p>
+            <w:pPr>
+              <w:spacing w:after="40" w:before="40"/>
+            </w:pPr>
+            <w:r>
+              <w:rPr>
+                <w:rFonts w:ascii="Calibri" w:hAnsi="Calibri" w:eastAsia="Calibri"/>
+                <w:b w:val="0"/>
+                <w:i w:val="0"/>
+                <w:sz w:val="20"/>
+              </w:rPr>
+              <w:t>Дежурство на простой, сертификат, поддомены из офиса и пустую ночную выгрузку Macro.</w:t>
+            </w:r>
+          </w:p>
+        </w:tc>
+        <w:tc>
+          <w:tcPr>
+            <w:tcW w:type="dxa" w:w="1474"/>
+            <w:vAlign w:val="top"/>
+          </w:tcPr>
+          <w:p>
+            <w:pPr>
+              <w:spacing w:after="40" w:before="40"/>
+            </w:pPr>
+            <w:r>
+              <w:rPr>
+                <w:rFonts w:ascii="Calibri" w:hAnsi="Calibri" w:eastAsia="Calibri"/>
+                <w:b/>
+                <w:i w:val="0"/>
+                <w:sz w:val="20"/>
+              </w:rPr>
+              <w:t>ЭНКО</w:t>
+            </w:r>
+          </w:p>
+        </w:tc>
+      </w:tr>
+      <w:tr>
+        <w:tc>
+          <w:tcPr>
+            <w:tcW w:type="dxa" w:w="680"/>
+            <w:shd w:val="clear" w:color="auto" w:fill="F7F4EE"/>
+            <w:vAlign w:val="top"/>
+          </w:tcPr>
+          <w:p>
+            <w:pPr>
+              <w:spacing w:after="40" w:before="40"/>
+            </w:pPr>
+            <w:r>
+              <w:rPr>
+                <w:rFonts w:ascii="Calibri" w:hAnsi="Calibri" w:eastAsia="Calibri"/>
+                <w:b w:val="0"/>
+                <w:i w:val="0"/>
+                <w:sz w:val="20"/>
+              </w:rPr>
+              <w:t>48</w:t>
+            </w:r>
+          </w:p>
+        </w:tc>
+        <w:tc>
+          <w:tcPr>
+            <w:tcW w:type="dxa" w:w="1474"/>
+            <w:shd w:val="clear" w:color="auto" w:fill="F7F4EE"/>
+            <w:vAlign w:val="top"/>
+          </w:tcPr>
+          <w:p>
+            <w:pPr>
+              <w:spacing w:after="40" w:before="40"/>
+            </w:pPr>
+            <w:r>
+              <w:rPr>
+                <w:rFonts w:ascii="Calibri" w:hAnsi="Calibri" w:eastAsia="Calibri"/>
+                <w:b w:val="0"/>
+                <w:i w:val="0"/>
+                <w:sz w:val="20"/>
+              </w:rPr>
+              <w:t>30 дней</w:t>
+            </w:r>
+          </w:p>
+        </w:tc>
+        <w:tc>
+          <w:tcPr>
+            <w:tcW w:type="dxa" w:w="6350"/>
+            <w:shd w:val="clear" w:color="auto" w:fill="F7F4EE"/>
+            <w:vAlign w:val="top"/>
+          </w:tcPr>
+          <w:p>
+            <w:pPr>
+              <w:spacing w:after="40" w:before="40"/>
+            </w:pPr>
+            <w:r>
+              <w:rPr>
+                <w:rFonts w:ascii="Calibri" w:hAnsi="Calibri" w:eastAsia="Calibri"/>
+                <w:b w:val="0"/>
+                <w:i w:val="0"/>
+                <w:sz w:val="20"/>
+              </w:rPr>
+              <w:t>Один простой или одна редактура документа — одна заявка. Повтор связывают. Исторические копии пачкой не переносить.</w:t>
+            </w:r>
+          </w:p>
+        </w:tc>
+        <w:tc>
+          <w:tcPr>
+            <w:tcW w:type="dxa" w:w="1474"/>
+            <w:shd w:val="clear" w:color="auto" w:fill="F7F4EE"/>
+            <w:vAlign w:val="top"/>
+          </w:tcPr>
+          <w:p>
+            <w:pPr>
+              <w:spacing w:after="40" w:before="40"/>
+            </w:pPr>
+            <w:r>
+              <w:rPr>
+                <w:rFonts w:ascii="Calibri" w:hAnsi="Calibri" w:eastAsia="Calibri"/>
+                <w:b/>
+                <w:i w:val="0"/>
+                <w:sz w:val="20"/>
+              </w:rPr>
+              <w:t>ЭНКО</w:t>
+            </w:r>
+          </w:p>
+        </w:tc>
+      </w:tr>
+      <w:tr>
+        <w:tc>
+          <w:tcPr>
+            <w:tcW w:type="dxa" w:w="680"/>
+            <w:vAlign w:val="top"/>
+          </w:tcPr>
+          <w:p>
+            <w:pPr>
+              <w:spacing w:after="40" w:before="40"/>
+            </w:pPr>
+            <w:r>
+              <w:rPr>
+                <w:rFonts w:ascii="Calibri" w:hAnsi="Calibri" w:eastAsia="Calibri"/>
+                <w:b w:val="0"/>
+                <w:i w:val="0"/>
+                <w:sz w:val="20"/>
+              </w:rPr>
+              <w:t>49</w:t>
+            </w:r>
+          </w:p>
+        </w:tc>
+        <w:tc>
+          <w:tcPr>
+            <w:tcW w:type="dxa" w:w="1474"/>
+            <w:vAlign w:val="top"/>
+          </w:tcPr>
+          <w:p>
+            <w:pPr>
+              <w:spacing w:after="40" w:before="40"/>
+            </w:pPr>
+            <w:r>
+              <w:rPr>
+                <w:rFonts w:ascii="Calibri" w:hAnsi="Calibri" w:eastAsia="Calibri"/>
+                <w:b w:val="0"/>
+                <w:i w:val="0"/>
+                <w:sz w:val="20"/>
+              </w:rPr>
+              <w:t>30 дней</w:t>
+            </w:r>
+          </w:p>
+        </w:tc>
+        <w:tc>
+          <w:tcPr>
+            <w:tcW w:type="dxa" w:w="6350"/>
+            <w:vAlign w:val="top"/>
+          </w:tcPr>
+          <w:p>
+            <w:pPr>
+              <w:spacing w:after="40" w:before="40"/>
+            </w:pPr>
+            <w:r>
+              <w:rPr>
+                <w:rFonts w:ascii="Calibri" w:hAnsi="Calibri" w:eastAsia="Calibri"/>
+                <w:b w:val="0"/>
+                <w:i w:val="0"/>
+                <w:sz w:val="20"/>
+              </w:rPr>
+              <w:t>В категорию сайтов не заводить портал, вики, Mindbox и топливные карты. Смешанную заявку помечать: какая половина про витрину.</w:t>
+            </w:r>
+          </w:p>
+        </w:tc>
+        <w:tc>
+          <w:tcPr>
+            <w:tcW w:type="dxa" w:w="1474"/>
+            <w:vAlign w:val="top"/>
+          </w:tcPr>
+          <w:p>
+            <w:pPr>
+              <w:spacing w:after="40" w:before="40"/>
+            </w:pPr>
+            <w:r>
+              <w:rPr>
+                <w:rFonts w:ascii="Calibri" w:hAnsi="Calibri" w:eastAsia="Calibri"/>
+                <w:b/>
+                <w:i w:val="0"/>
+                <w:sz w:val="20"/>
+              </w:rPr>
+              <w:t>ЭНКО</w:t>
+            </w:r>
+          </w:p>
+        </w:tc>
+      </w:tr>
+      <w:tr>
+        <w:tc>
+          <w:tcPr>
+            <w:tcW w:type="dxa" w:w="680"/>
+            <w:shd w:val="clear" w:color="auto" w:fill="F7F4EE"/>
+            <w:vAlign w:val="top"/>
+          </w:tcPr>
+          <w:p>
+            <w:pPr>
+              <w:spacing w:after="40" w:before="40"/>
+            </w:pPr>
+            <w:r>
+              <w:rPr>
+                <w:rFonts w:ascii="Calibri" w:hAnsi="Calibri" w:eastAsia="Calibri"/>
+                <w:b w:val="0"/>
+                <w:i w:val="0"/>
+                <w:sz w:val="20"/>
+              </w:rPr>
+              <w:t>50</w:t>
+            </w:r>
+          </w:p>
+        </w:tc>
+        <w:tc>
+          <w:tcPr>
+            <w:tcW w:type="dxa" w:w="1474"/>
+            <w:shd w:val="clear" w:color="auto" w:fill="F7F4EE"/>
+            <w:vAlign w:val="top"/>
+          </w:tcPr>
+          <w:p>
+            <w:pPr>
+              <w:spacing w:after="40" w:before="40"/>
+            </w:pPr>
+            <w:r>
+              <w:rPr>
+                <w:rFonts w:ascii="Calibri" w:hAnsi="Calibri" w:eastAsia="Calibri"/>
+                <w:b w:val="0"/>
+                <w:i w:val="0"/>
+                <w:sz w:val="20"/>
+              </w:rPr>
+              <w:t>30 дней</w:t>
+            </w:r>
+          </w:p>
+        </w:tc>
+        <w:tc>
+          <w:tcPr>
+            <w:tcW w:type="dxa" w:w="6350"/>
+            <w:shd w:val="clear" w:color="auto" w:fill="F7F4EE"/>
+            <w:vAlign w:val="top"/>
+          </w:tcPr>
+          <w:p>
+            <w:pPr>
+              <w:spacing w:after="40" w:before="40"/>
+            </w:pPr>
+            <w:r>
+              <w:rPr>
+                <w:rFonts w:ascii="Calibri" w:hAnsi="Calibri" w:eastAsia="Calibri"/>
+                <w:b w:val="0"/>
+                <w:i w:val="0"/>
+                <w:sz w:val="20"/>
+              </w:rPr>
+              <w:t>Авторы контента публикуют сами или через роль внутри ЭНКО. Замена текста больше не ждёт разработчика коробки.</w:t>
+            </w:r>
+          </w:p>
+        </w:tc>
+        <w:tc>
+          <w:tcPr>
+            <w:tcW w:type="dxa" w:w="1474"/>
+            <w:shd w:val="clear" w:color="auto" w:fill="F7F4EE"/>
+            <w:vAlign w:val="top"/>
+          </w:tcPr>
+          <w:p>
+            <w:pPr>
+              <w:spacing w:after="40" w:before="40"/>
+            </w:pPr>
+            <w:r>
+              <w:rPr>
+                <w:rFonts w:ascii="Calibri" w:hAnsi="Calibri" w:eastAsia="Calibri"/>
+                <w:b/>
+                <w:i w:val="0"/>
+                <w:sz w:val="20"/>
+              </w:rPr>
+              <w:t>ЭНКО</w:t>
+            </w:r>
+          </w:p>
+        </w:tc>
+      </w:tr>
+      <w:tr>
+        <w:tc>
+          <w:tcPr>
+            <w:tcW w:type="dxa" w:w="680"/>
+            <w:vAlign w:val="top"/>
+          </w:tcPr>
+          <w:p>
+            <w:pPr>
+              <w:spacing w:after="40" w:before="40"/>
+            </w:pPr>
+            <w:r>
+              <w:rPr>
+                <w:rFonts w:ascii="Calibri" w:hAnsi="Calibri" w:eastAsia="Calibri"/>
+                <w:b w:val="0"/>
+                <w:i w:val="0"/>
+                <w:sz w:val="20"/>
+              </w:rPr>
+              <w:t>51</w:t>
+            </w:r>
+          </w:p>
+        </w:tc>
+        <w:tc>
+          <w:tcPr>
+            <w:tcW w:type="dxa" w:w="1474"/>
+            <w:vAlign w:val="top"/>
+          </w:tcPr>
+          <w:p>
+            <w:pPr>
+              <w:spacing w:after="40" w:before="40"/>
+            </w:pPr>
+            <w:r>
+              <w:rPr>
+                <w:rFonts w:ascii="Calibri" w:hAnsi="Calibri" w:eastAsia="Calibri"/>
+                <w:b w:val="0"/>
+                <w:i w:val="0"/>
+                <w:sz w:val="20"/>
+              </w:rPr>
+              <w:t>30 дней</w:t>
+            </w:r>
+          </w:p>
+        </w:tc>
+        <w:tc>
+          <w:tcPr>
+            <w:tcW w:type="dxa" w:w="6350"/>
+            <w:vAlign w:val="top"/>
+          </w:tcPr>
+          <w:p>
+            <w:pPr>
+              <w:spacing w:after="40" w:before="40"/>
+            </w:pPr>
+            <w:r>
+              <w:rPr>
+                <w:rFonts w:ascii="Calibri" w:hAnsi="Calibri" w:eastAsia="Calibri"/>
+                <w:b w:val="0"/>
+                <w:i w:val="0"/>
+                <w:sz w:val="20"/>
+              </w:rPr>
+              <w:t>Открытый хвост: в разборе по имени «в процессе» указана HD-15790 (Полис-онлайн). Остальные пять ключей в тексте не названы — выгрузить заново и оставить только витрину.</w:t>
+            </w:r>
+          </w:p>
+        </w:tc>
+        <w:tc>
+          <w:tcPr>
+            <w:tcW w:type="dxa" w:w="1474"/>
+            <w:vAlign w:val="top"/>
+          </w:tcPr>
+          <w:p>
+            <w:pPr>
+              <w:spacing w:after="40" w:before="40"/>
+            </w:pPr>
+            <w:r>
+              <w:rPr>
+                <w:rFonts w:ascii="Calibri" w:hAnsi="Calibri" w:eastAsia="Calibri"/>
+                <w:b/>
+                <w:i w:val="0"/>
+                <w:sz w:val="20"/>
+              </w:rPr>
+              <w:t>вместе</w:t>
+            </w:r>
+          </w:p>
+        </w:tc>
+      </w:tr>
+      <w:tr>
+        <w:tc>
+          <w:tcPr>
+            <w:tcW w:type="dxa" w:w="680"/>
+            <w:shd w:val="clear" w:color="auto" w:fill="F7F4EE"/>
+            <w:vAlign w:val="top"/>
+          </w:tcPr>
+          <w:p>
+            <w:pPr>
+              <w:spacing w:after="40" w:before="40"/>
+            </w:pPr>
+            <w:r>
+              <w:rPr>
+                <w:rFonts w:ascii="Calibri" w:hAnsi="Calibri" w:eastAsia="Calibri"/>
+                <w:b w:val="0"/>
+                <w:i w:val="0"/>
+                <w:sz w:val="20"/>
+              </w:rPr>
+              <w:t>52</w:t>
+            </w:r>
+          </w:p>
+        </w:tc>
+        <w:tc>
+          <w:tcPr>
+            <w:tcW w:type="dxa" w:w="1474"/>
+            <w:shd w:val="clear" w:color="auto" w:fill="F7F4EE"/>
+            <w:vAlign w:val="top"/>
+          </w:tcPr>
+          <w:p>
+            <w:pPr>
+              <w:spacing w:after="40" w:before="40"/>
+            </w:pPr>
+            <w:r>
+              <w:rPr>
+                <w:rFonts w:ascii="Calibri" w:hAnsi="Calibri" w:eastAsia="Calibri"/>
+                <w:b w:val="0"/>
+                <w:i w:val="0"/>
+                <w:sz w:val="20"/>
+              </w:rPr>
+              <w:t>30 дней</w:t>
+            </w:r>
+          </w:p>
+        </w:tc>
+        <w:tc>
+          <w:tcPr>
+            <w:tcW w:type="dxa" w:w="6350"/>
+            <w:shd w:val="clear" w:color="auto" w:fill="F7F4EE"/>
+            <w:vAlign w:val="top"/>
+          </w:tcPr>
+          <w:p>
+            <w:pPr>
+              <w:spacing w:after="40" w:before="40"/>
+            </w:pPr>
+            <w:r>
+              <w:rPr>
+                <w:rFonts w:ascii="Calibri" w:hAnsi="Calibri" w:eastAsia="Calibri"/>
+                <w:b w:val="0"/>
+                <w:i w:val="0"/>
+                <w:sz w:val="20"/>
+              </w:rPr>
+              <w:t>На Macro, Движ, коллбэк и оплату записать владельца внутри ЭНКО.</w:t>
+            </w:r>
+          </w:p>
+        </w:tc>
+        <w:tc>
+          <w:tcPr>
+            <w:tcW w:type="dxa" w:w="1474"/>
+            <w:shd w:val="clear" w:color="auto" w:fill="F7F4EE"/>
+            <w:vAlign w:val="top"/>
+          </w:tcPr>
+          <w:p>
+            <w:pPr>
+              <w:spacing w:after="40" w:before="40"/>
+            </w:pPr>
+            <w:r>
+              <w:rPr>
+                <w:rFonts w:ascii="Calibri" w:hAnsi="Calibri" w:eastAsia="Calibri"/>
+                <w:b/>
+                <w:i w:val="0"/>
+                <w:sz w:val="20"/>
+              </w:rPr>
+              <w:t>ЭНКО</w:t>
+            </w:r>
+          </w:p>
+        </w:tc>
+      </w:tr>
+      <w:tr>
+        <w:tc>
+          <w:tcPr>
+            <w:tcW w:type="dxa" w:w="680"/>
+            <w:vAlign w:val="top"/>
+          </w:tcPr>
+          <w:p>
+            <w:pPr>
+              <w:spacing w:after="40" w:before="40"/>
+            </w:pPr>
+            <w:r>
+              <w:rPr>
+                <w:rFonts w:ascii="Calibri" w:hAnsi="Calibri" w:eastAsia="Calibri"/>
+                <w:b w:val="0"/>
+                <w:i w:val="0"/>
+                <w:sz w:val="20"/>
+              </w:rPr>
+              <w:t>53</w:t>
+            </w:r>
+          </w:p>
+        </w:tc>
+        <w:tc>
+          <w:tcPr>
+            <w:tcW w:type="dxa" w:w="1474"/>
+            <w:vAlign w:val="top"/>
+          </w:tcPr>
+          <w:p>
+            <w:pPr>
+              <w:spacing w:after="40" w:before="40"/>
+            </w:pPr>
+            <w:r>
+              <w:rPr>
+                <w:rFonts w:ascii="Calibri" w:hAnsi="Calibri" w:eastAsia="Calibri"/>
+                <w:b w:val="0"/>
+                <w:i w:val="0"/>
+                <w:sz w:val="20"/>
+              </w:rPr>
+              <w:t>30 дней</w:t>
+            </w:r>
+          </w:p>
+        </w:tc>
+        <w:tc>
+          <w:tcPr>
+            <w:tcW w:type="dxa" w:w="6350"/>
+            <w:vAlign w:val="top"/>
+          </w:tcPr>
+          <w:p>
+            <w:pPr>
+              <w:spacing w:after="40" w:before="40"/>
+            </w:pPr>
+            <w:r>
+              <w:rPr>
+                <w:rFonts w:ascii="Calibri" w:hAnsi="Calibri" w:eastAsia="Calibri"/>
+                <w:b w:val="0"/>
+                <w:i w:val="0"/>
+                <w:sz w:val="20"/>
+              </w:rPr>
+              <w:t>Отдельным решением закрыть судьбу tender-enco72.ru и convis-enco.ru. К переносу продающей витрины их не пристёгивать.</w:t>
+            </w:r>
+          </w:p>
+        </w:tc>
+        <w:tc>
+          <w:tcPr>
+            <w:tcW w:type="dxa" w:w="1474"/>
+            <w:vAlign w:val="top"/>
+          </w:tcPr>
+          <w:p>
+            <w:pPr>
+              <w:spacing w:after="40" w:before="40"/>
+            </w:pPr>
+            <w:r>
+              <w:rPr>
+                <w:rFonts w:ascii="Calibri" w:hAnsi="Calibri" w:eastAsia="Calibri"/>
+                <w:b/>
+                <w:i w:val="0"/>
+                <w:sz w:val="20"/>
+              </w:rPr>
+              <w:t>ЭНКО</w:t>
+            </w:r>
+          </w:p>
+        </w:tc>
+      </w:tr>
+      <w:tr>
+        <w:tc>
+          <w:tcPr>
+            <w:tcW w:type="dxa" w:w="680"/>
+            <w:shd w:val="clear" w:color="auto" w:fill="F7F4EE"/>
+            <w:vAlign w:val="top"/>
+          </w:tcPr>
+          <w:p>
+            <w:pPr>
+              <w:spacing w:after="40" w:before="40"/>
+            </w:pPr>
+            <w:r>
+              <w:rPr>
+                <w:rFonts w:ascii="Calibri" w:hAnsi="Calibri" w:eastAsia="Calibri"/>
+                <w:b w:val="0"/>
+                <w:i w:val="0"/>
+                <w:sz w:val="20"/>
+              </w:rPr>
+              <w:t>54</w:t>
+            </w:r>
+          </w:p>
+        </w:tc>
+        <w:tc>
+          <w:tcPr>
+            <w:tcW w:type="dxa" w:w="1474"/>
+            <w:shd w:val="clear" w:color="auto" w:fill="F7F4EE"/>
+            <w:vAlign w:val="top"/>
+          </w:tcPr>
+          <w:p>
+            <w:pPr>
+              <w:spacing w:after="40" w:before="40"/>
+            </w:pPr>
+            <w:r>
+              <w:rPr>
+                <w:rFonts w:ascii="Calibri" w:hAnsi="Calibri" w:eastAsia="Calibri"/>
+                <w:b w:val="0"/>
+                <w:i w:val="0"/>
+                <w:sz w:val="20"/>
+              </w:rPr>
+              <w:t>30 дней</w:t>
+            </w:r>
+          </w:p>
+        </w:tc>
+        <w:tc>
+          <w:tcPr>
+            <w:tcW w:type="dxa" w:w="6350"/>
+            <w:shd w:val="clear" w:color="auto" w:fill="F7F4EE"/>
+            <w:vAlign w:val="top"/>
+          </w:tcPr>
+          <w:p>
+            <w:pPr>
+              <w:spacing w:after="40" w:before="40"/>
+            </w:pPr>
+            <w:r>
+              <w:rPr>
+                <w:rFonts w:ascii="Calibri" w:hAnsi="Calibri" w:eastAsia="Calibri"/>
+                <w:b w:val="0"/>
+                <w:i w:val="0"/>
+                <w:sz w:val="20"/>
+              </w:rPr>
+              <w:t>На 30-й день проверить, что новые заявки ложатся в восемь тем разбора. Тип Jira со смыслом в выгрузке не совпадал.</w:t>
+            </w:r>
+          </w:p>
+        </w:tc>
+        <w:tc>
+          <w:tcPr>
+            <w:tcW w:type="dxa" w:w="1474"/>
+            <w:shd w:val="clear" w:color="auto" w:fill="F7F4EE"/>
+            <w:vAlign w:val="top"/>
+          </w:tcPr>
+          <w:p>
+            <w:pPr>
+              <w:spacing w:after="40" w:before="40"/>
+            </w:pPr>
+            <w:r>
+              <w:rPr>
+                <w:rFonts w:ascii="Calibri" w:hAnsi="Calibri" w:eastAsia="Calibri"/>
+                <w:b/>
+                <w:i w:val="0"/>
+                <w:sz w:val="20"/>
+              </w:rPr>
+              <w:t>ЭНКО</w:t>
+            </w:r>
+          </w:p>
+        </w:tc>
+      </w:tr>
+      <w:tr>
+        <w:tc>
+          <w:tcPr>
+            <w:tcW w:type="dxa" w:w="680"/>
+            <w:vAlign w:val="top"/>
+          </w:tcPr>
+          <w:p>
+            <w:pPr>
+              <w:spacing w:after="40" w:before="40"/>
+            </w:pPr>
+            <w:r>
+              <w:rPr>
+                <w:rFonts w:ascii="Calibri" w:hAnsi="Calibri" w:eastAsia="Calibri"/>
+                <w:b w:val="0"/>
+                <w:i w:val="0"/>
+                <w:sz w:val="20"/>
+              </w:rPr>
+              <w:t>55</w:t>
+            </w:r>
+          </w:p>
+        </w:tc>
+        <w:tc>
+          <w:tcPr>
+            <w:tcW w:type="dxa" w:w="1474"/>
+            <w:vAlign w:val="top"/>
+          </w:tcPr>
+          <w:p>
+            <w:pPr>
+              <w:spacing w:after="40" w:before="40"/>
+            </w:pPr>
+            <w:r>
+              <w:rPr>
+                <w:rFonts w:ascii="Calibri" w:hAnsi="Calibri" w:eastAsia="Calibri"/>
+                <w:b w:val="0"/>
+                <w:i w:val="0"/>
+                <w:sz w:val="20"/>
+              </w:rPr>
+              <w:t>30 дней</w:t>
+            </w:r>
+          </w:p>
+        </w:tc>
+        <w:tc>
+          <w:tcPr>
+            <w:tcW w:type="dxa" w:w="6350"/>
+            <w:vAlign w:val="top"/>
+          </w:tcPr>
+          <w:p>
+            <w:pPr>
+              <w:spacing w:after="40" w:before="40"/>
+            </w:pPr>
+            <w:r>
+              <w:rPr>
+                <w:rFonts w:ascii="Calibri" w:hAnsi="Calibri" w:eastAsia="Calibri"/>
+                <w:b w:val="0"/>
+                <w:i w:val="0"/>
+                <w:sz w:val="20"/>
+              </w:rPr>
+              <w:t>Записать срок лицензии коробки. Льготное продление чат ограничивает 90 днями до конца и 15 днями после. После срока чат пишет, что встанут Маркетплейс, REST, вебхуки, облачная телефония, CRM-формы и чат-боты. Разбор этого срока не содержит.</w:t>
+            </w:r>
+          </w:p>
+        </w:tc>
+        <w:tc>
+          <w:tcPr>
+            <w:tcW w:type="dxa" w:w="1474"/>
+            <w:vAlign w:val="top"/>
+          </w:tcPr>
+          <w:p>
+            <w:pPr>
+              <w:spacing w:after="40" w:before="40"/>
+            </w:pPr>
+            <w:r>
+              <w:rPr>
+                <w:rFonts w:ascii="Calibri" w:hAnsi="Calibri" w:eastAsia="Calibri"/>
+                <w:b/>
+                <w:i w:val="0"/>
+                <w:sz w:val="20"/>
+              </w:rPr>
+              <w:t>ЭНКО</w:t>
+            </w:r>
+          </w:p>
+        </w:tc>
+      </w:tr>
+      <w:tr>
+        <w:tc>
+          <w:tcPr>
+            <w:tcW w:type="dxa" w:w="680"/>
+            <w:shd w:val="clear" w:color="auto" w:fill="F7F4EE"/>
+            <w:vAlign w:val="top"/>
+          </w:tcPr>
+          <w:p>
+            <w:pPr>
+              <w:spacing w:after="40" w:before="40"/>
+            </w:pPr>
+            <w:r>
+              <w:rPr>
+                <w:rFonts w:ascii="Calibri" w:hAnsi="Calibri" w:eastAsia="Calibri"/>
+                <w:b w:val="0"/>
+                <w:i w:val="0"/>
+                <w:sz w:val="20"/>
+              </w:rPr>
+              <w:t>56</w:t>
+            </w:r>
+          </w:p>
+        </w:tc>
+        <w:tc>
+          <w:tcPr>
+            <w:tcW w:type="dxa" w:w="1474"/>
+            <w:shd w:val="clear" w:color="auto" w:fill="F7F4EE"/>
+            <w:vAlign w:val="top"/>
+          </w:tcPr>
+          <w:p>
+            <w:pPr>
+              <w:spacing w:after="40" w:before="40"/>
+            </w:pPr>
+            <w:r>
+              <w:rPr>
+                <w:rFonts w:ascii="Calibri" w:hAnsi="Calibri" w:eastAsia="Calibri"/>
+                <w:b w:val="0"/>
+                <w:i w:val="0"/>
+                <w:sz w:val="20"/>
+              </w:rPr>
+              <w:t>30 дней</w:t>
+            </w:r>
+          </w:p>
+        </w:tc>
+        <w:tc>
+          <w:tcPr>
+            <w:tcW w:type="dxa" w:w="6350"/>
+            <w:shd w:val="clear" w:color="auto" w:fill="F7F4EE"/>
+            <w:vAlign w:val="top"/>
+          </w:tcPr>
+          <w:p>
+            <w:pPr>
+              <w:spacing w:after="40" w:before="40"/>
+            </w:pPr>
+            <w:r>
+              <w:rPr>
+                <w:rFonts w:ascii="Calibri" w:hAnsi="Calibri" w:eastAsia="Calibri"/>
+                <w:b w:val="0"/>
+                <w:i w:val="0"/>
+                <w:sz w:val="20"/>
+              </w:rPr>
+              <w:t>Если внешний мониторинг уже есть, алерты идут в ЭНКО, не разработчику. UptimeRobot в чате — пример, в разборе его нет: простои приходят заявками из офисов.</w:t>
+            </w:r>
+          </w:p>
+        </w:tc>
+        <w:tc>
+          <w:tcPr>
+            <w:tcW w:type="dxa" w:w="1474"/>
+            <w:shd w:val="clear" w:color="auto" w:fill="F7F4EE"/>
+            <w:vAlign w:val="top"/>
+          </w:tcPr>
+          <w:p>
+            <w:pPr>
+              <w:spacing w:after="40" w:before="40"/>
+            </w:pPr>
+            <w:r>
+              <w:rPr>
+                <w:rFonts w:ascii="Calibri" w:hAnsi="Calibri" w:eastAsia="Calibri"/>
+                <w:b/>
+                <w:i w:val="0"/>
+                <w:sz w:val="20"/>
+              </w:rPr>
+              <w:t>ЭНКО</w:t>
+            </w:r>
+          </w:p>
+        </w:tc>
+      </w:tr>
+      <w:tr>
+        <w:tc>
+          <w:tcPr>
+            <w:tcW w:type="dxa" w:w="680"/>
+            <w:vAlign w:val="top"/>
+          </w:tcPr>
+          <w:p>
+            <w:pPr>
+              <w:spacing w:after="40" w:before="40"/>
+            </w:pPr>
+            <w:r>
+              <w:rPr>
+                <w:rFonts w:ascii="Calibri" w:hAnsi="Calibri" w:eastAsia="Calibri"/>
+                <w:b w:val="0"/>
+                <w:i w:val="0"/>
+                <w:sz w:val="20"/>
+              </w:rPr>
+              <w:t>57</w:t>
+            </w:r>
+          </w:p>
+        </w:tc>
+        <w:tc>
+          <w:tcPr>
+            <w:tcW w:type="dxa" w:w="1474"/>
+            <w:vAlign w:val="top"/>
+          </w:tcPr>
+          <w:p>
+            <w:pPr>
+              <w:spacing w:after="40" w:before="40"/>
+            </w:pPr>
+            <w:r>
+              <w:rPr>
+                <w:rFonts w:ascii="Calibri" w:hAnsi="Calibri" w:eastAsia="Calibri"/>
+                <w:b w:val="0"/>
+                <w:i w:val="0"/>
+                <w:sz w:val="20"/>
+              </w:rPr>
+              <w:t>30 дней</w:t>
+            </w:r>
+          </w:p>
+        </w:tc>
+        <w:tc>
+          <w:tcPr>
+            <w:tcW w:type="dxa" w:w="6350"/>
+            <w:vAlign w:val="top"/>
+          </w:tcPr>
+          <w:p>
+            <w:pPr>
+              <w:spacing w:after="40" w:before="40"/>
+            </w:pPr>
+            <w:r>
+              <w:rPr>
+                <w:rFonts w:ascii="Calibri" w:hAnsi="Calibri" w:eastAsia="Calibri"/>
+                <w:b w:val="0"/>
+                <w:i w:val="0"/>
+                <w:sz w:val="20"/>
+              </w:rPr>
+              <w:t>Пароли коробки, root и связок лежат в хранилище ЭНКО, не в заявках. Сходится с разбором: пароль из HD-15790 в материалы не переносили.</w:t>
+            </w:r>
+          </w:p>
+        </w:tc>
+        <w:tc>
+          <w:tcPr>
+            <w:tcW w:type="dxa" w:w="1474"/>
             <w:vAlign w:val="top"/>
           </w:tcPr>
           <w:p>
@@ -9983,6 +12352,293 @@
                 <w:sz w:val="20"/>
               </w:rPr>
               <w:t>Право публиковать контакт, оферту, плашку, динамику и блок презентации есть внутри ЭНКО. Иначе витрина снова встанет на одного человека.</w:t>
+            </w:r>
+          </w:p>
+        </w:tc>
+      </w:tr>
+    </w:tbl>
+    <w:p/>
+    <w:p>
+      <w:pPr>
+        <w:pStyle w:val="Heading3"/>
+      </w:pPr>
+      <w:r>
+        <w:t>Что к рискам добавляет чат про коробку</w:t>
+      </w:r>
+    </w:p>
+    <w:p>
+      <w:r>
+        <w:t>Эти строки не из очереди заявок. Их источник — чат про чужую коробку. Пока инвентаризация их не подтвердила, это риски допущения, не найденные инциденты.</w:t>
+      </w:r>
+    </w:p>
+    <w:tbl>
+      <w:tblPr>
+        <w:tblStyle w:val="TableGrid"/>
+        <w:tblW w:type="dxa" w:w="9979"/>
+        <w:tblLayout w:type="fixed"/>
+        <w:tblLook w:firstColumn="1" w:firstRow="1" w:lastColumn="0" w:lastRow="0" w:noHBand="0" w:noVBand="1" w:val="04A0"/>
+      </w:tblPr>
+      <w:tblGrid>
+        <w:gridCol w:w="2381"/>
+        <w:gridCol w:w="4309"/>
+        <w:gridCol w:w="3288"/>
+      </w:tblGrid>
+      <w:tr>
+        <w:trPr>
+          <w:tblHeader w:val="true"/>
+        </w:trPr>
+        <w:tc>
+          <w:tcPr>
+            <w:tcW w:type="dxa" w:w="2381"/>
+            <w:shd w:val="clear" w:color="auto" w:fill="1E2A24"/>
+            <w:vAlign w:val="top"/>
+          </w:tcPr>
+          <w:p>
+            <w:pPr>
+              <w:spacing w:after="40" w:before="40"/>
+            </w:pPr>
+            <w:r>
+              <w:rPr>
+                <w:rFonts w:ascii="Calibri" w:hAnsi="Calibri" w:eastAsia="Calibri"/>
+                <w:b/>
+                <w:i w:val="0"/>
+                <w:color w:val="F4F1EA"/>
+                <w:sz w:val="20"/>
+              </w:rPr>
+              <w:t>Риск</w:t>
+            </w:r>
+          </w:p>
+        </w:tc>
+        <w:tc>
+          <w:tcPr>
+            <w:tcW w:type="dxa" w:w="4309"/>
+            <w:shd w:val="clear" w:color="auto" w:fill="1E2A24"/>
+            <w:vAlign w:val="top"/>
+          </w:tcPr>
+          <w:p>
+            <w:pPr>
+              <w:spacing w:after="40" w:before="40"/>
+            </w:pPr>
+            <w:r>
+              <w:rPr>
+                <w:rFonts w:ascii="Calibri" w:hAnsi="Calibri" w:eastAsia="Calibri"/>
+                <w:b/>
+                <w:i w:val="0"/>
+                <w:color w:val="F4F1EA"/>
+                <w:sz w:val="20"/>
+              </w:rPr>
+              <w:t>Как говорит чат</w:t>
+            </w:r>
+          </w:p>
+        </w:tc>
+        <w:tc>
+          <w:tcPr>
+            <w:tcW w:type="dxa" w:w="3288"/>
+            <w:shd w:val="clear" w:color="auto" w:fill="1E2A24"/>
+            <w:vAlign w:val="top"/>
+          </w:tcPr>
+          <w:p>
+            <w:pPr>
+              <w:spacing w:after="40" w:before="40"/>
+            </w:pPr>
+            <w:r>
+              <w:rPr>
+                <w:rFonts w:ascii="Calibri" w:hAnsi="Calibri" w:eastAsia="Calibri"/>
+                <w:b/>
+                <w:i w:val="0"/>
+                <w:color w:val="F4F1EA"/>
+                <w:sz w:val="20"/>
+              </w:rPr>
+              <w:t>Что сделать</w:t>
+            </w:r>
+          </w:p>
+        </w:tc>
+      </w:tr>
+      <w:tr>
+        <w:tc>
+          <w:tcPr>
+            <w:tcW w:type="dxa" w:w="2381"/>
+            <w:vAlign w:val="top"/>
+          </w:tcPr>
+          <w:p>
+            <w:pPr>
+              <w:spacing w:after="40" w:before="40"/>
+            </w:pPr>
+            <w:r>
+              <w:rPr>
+                <w:rFonts w:ascii="Calibri" w:hAnsi="Calibri" w:eastAsia="Calibri"/>
+                <w:b w:val="0"/>
+                <w:i w:val="0"/>
+                <w:sz w:val="20"/>
+              </w:rPr>
+              <w:t>Ключ висит на подрядчике</w:t>
+            </w:r>
+          </w:p>
+        </w:tc>
+        <w:tc>
+          <w:tcPr>
+            <w:tcW w:type="dxa" w:w="4309"/>
+            <w:vAlign w:val="top"/>
+          </w:tcPr>
+          <w:p>
+            <w:pPr>
+              <w:spacing w:after="40" w:before="40"/>
+            </w:pPr>
+            <w:r>
+              <w:rPr>
+                <w:rFonts w:ascii="Calibri" w:hAnsi="Calibri" w:eastAsia="Calibri"/>
+                <w:b w:val="0"/>
+                <w:i w:val="0"/>
+                <w:sz w:val="20"/>
+              </w:rPr>
+              <w:t>Пока лицензия в кабинете подрядчика на 1c-bitrix.ru, обновления контролирует не ЭНКО. После срока встают Маркетплейс, REST, вебхуки, облачная телефония, CRM-формы и чат-боты.</w:t>
+            </w:r>
+          </w:p>
+        </w:tc>
+        <w:tc>
+          <w:tcPr>
+            <w:tcW w:type="dxa" w:w="3288"/>
+            <w:vAlign w:val="top"/>
+          </w:tcPr>
+          <w:p>
+            <w:pPr>
+              <w:spacing w:after="40" w:before="40"/>
+            </w:pPr>
+            <w:r>
+              <w:rPr>
+                <w:rFonts w:ascii="Calibri" w:hAnsi="Calibri" w:eastAsia="Calibri"/>
+                <w:b w:val="0"/>
+                <w:i w:val="0"/>
+                <w:sz w:val="20"/>
+              </w:rPr>
+              <w:t>Перепривязать ключ до отключения сервера и записать дату окончания и окно 90 плюс 15 дней.</w:t>
+            </w:r>
+          </w:p>
+        </w:tc>
+      </w:tr>
+      <w:tr>
+        <w:tc>
+          <w:tcPr>
+            <w:tcW w:type="dxa" w:w="2381"/>
+            <w:shd w:val="clear" w:color="auto" w:fill="F7F4EE"/>
+            <w:vAlign w:val="top"/>
+          </w:tcPr>
+          <w:p>
+            <w:pPr>
+              <w:spacing w:after="40" w:before="40"/>
+            </w:pPr>
+            <w:r>
+              <w:rPr>
+                <w:rFonts w:ascii="Calibri" w:hAnsi="Calibri" w:eastAsia="Calibri"/>
+                <w:b w:val="0"/>
+                <w:i w:val="0"/>
+                <w:sz w:val="20"/>
+              </w:rPr>
+              <w:t>Чужие входы на сервер</w:t>
+            </w:r>
+          </w:p>
+        </w:tc>
+        <w:tc>
+          <w:tcPr>
+            <w:tcW w:type="dxa" w:w="4309"/>
+            <w:shd w:val="clear" w:color="auto" w:fill="F7F4EE"/>
+            <w:vAlign w:val="top"/>
+          </w:tcPr>
+          <w:p>
+            <w:pPr>
+              <w:spacing w:after="40" w:before="40"/>
+            </w:pPr>
+            <w:r>
+              <w:rPr>
+                <w:rFonts w:ascii="Calibri" w:hAnsi="Calibri" w:eastAsia="Calibri"/>
+                <w:b w:val="0"/>
+                <w:i w:val="0"/>
+                <w:sz w:val="20"/>
+              </w:rPr>
+              <w:t>authorized_keys, пользователи MySQL, root и строки cron могут остаться от подрядчика.</w:t>
+            </w:r>
+          </w:p>
+        </w:tc>
+        <w:tc>
+          <w:tcPr>
+            <w:tcW w:type="dxa" w:w="3288"/>
+            <w:shd w:val="clear" w:color="auto" w:fill="F7F4EE"/>
+            <w:vAlign w:val="top"/>
+          </w:tcPr>
+          <w:p>
+            <w:pPr>
+              <w:spacing w:after="40" w:before="40"/>
+            </w:pPr>
+            <w:r>
+              <w:rPr>
+                <w:rFonts w:ascii="Calibri" w:hAnsi="Calibri" w:eastAsia="Calibri"/>
+                <w:b w:val="0"/>
+                <w:i w:val="0"/>
+                <w:sz w:val="20"/>
+              </w:rPr>
+              <w:t>Смена паролей и просмотр этих списков входят в перенос, не в первые сутки после выключения старой машины.</w:t>
+            </w:r>
+          </w:p>
+        </w:tc>
+      </w:tr>
+      <w:tr>
+        <w:tc>
+          <w:tcPr>
+            <w:tcW w:type="dxa" w:w="2381"/>
+            <w:vAlign w:val="top"/>
+          </w:tcPr>
+          <w:p>
+            <w:pPr>
+              <w:spacing w:after="40" w:before="40"/>
+            </w:pPr>
+            <w:r>
+              <w:rPr>
+                <w:rFonts w:ascii="Calibri" w:hAnsi="Calibri" w:eastAsia="Calibri"/>
+                <w:b w:val="0"/>
+                <w:i w:val="0"/>
+                <w:sz w:val="20"/>
+              </w:rPr>
+              <w:t>Автоматизация на аккаунте подрядчика</w:t>
+            </w:r>
+          </w:p>
+        </w:tc>
+        <w:tc>
+          <w:tcPr>
+            <w:tcW w:type="dxa" w:w="4309"/>
+            <w:vAlign w:val="top"/>
+          </w:tcPr>
+          <w:p>
+            <w:pPr>
+              <w:spacing w:after="40" w:before="40"/>
+            </w:pPr>
+            <w:r>
+              <w:rPr>
+                <w:rFonts w:ascii="Calibri" w:hAnsi="Calibri" w:eastAsia="Calibri"/>
+                <w:b w:val="0"/>
+                <w:i w:val="0"/>
+                <w:sz w:val="20"/>
+              </w:rPr>
+              <w:t>После смены пароля вебхуки и роботы, завязанные на его пользователя, встают. Чат считает это ядром сайта.</w:t>
+            </w:r>
+          </w:p>
+        </w:tc>
+        <w:tc>
+          <w:tcPr>
+            <w:tcW w:type="dxa" w:w="3288"/>
+            <w:vAlign w:val="top"/>
+          </w:tcPr>
+          <w:p>
+            <w:pPr>
+              <w:spacing w:after="40" w:before="40"/>
+            </w:pPr>
+            <w:r>
+              <w:rPr>
+                <w:rFonts w:ascii="Calibri" w:hAnsi="Calibri" w:eastAsia="Calibri"/>
+                <w:b w:val="0"/>
+                <w:i w:val="0"/>
+                <w:sz w:val="20"/>
+              </w:rPr>
+              <w:t>Сначала реестр. Если вебхуков и роботов нет, риск закрыт отметкой. Связки из разбора (Macro, Движ, коллбэк, оплата) от этого реестра не зависят и проверяются отдельно.</w:t>
             </w:r>
           </w:p>
         </w:tc>
@@ -10045,6 +12701,639 @@
         <w:t>Пароли из текстов заявок в план не входят.</w:t>
       </w:r>
     </w:p>
+    <w:p>
+      <w:pPr>
+        <w:pStyle w:val="ListBullet"/>
+      </w:pPr>
+      <w:r>
+        <w:t>Из чата не взято как работа ЭНКО: облачный чек-лист (конструктор «Сайты и магазины», право «Публикация», экспорт сайта как перенос только шаблона), пример отчёта «Монитор качества» с цифрами 21 из 66 (это иллюстрация чата, не результат ЭНКО; сам монитор чат даёт для 1С-Битрикс, не для коробки Битрикс24), канал заявок через WeChat, Google Analytics, кассы ЮKassa и Тинькофф как факт, обмен с 1С, поддомены m и api, промокод как существующий сценарий, нагрузка в 50 одновременных входов.</w:t>
+      </w:r>
+    </w:p>
+    <w:p>
+      <w:pPr>
+        <w:pStyle w:val="Heading2"/>
+      </w:pPr>
+      <w:r>
+        <w:t>Где чат и разбор расходятся</w:t>
+      </w:r>
+    </w:p>
+    <w:p>
+      <w:r>
+        <w:t>Оба источника остаются. План не выбирает молча одну сторону.</w:t>
+      </w:r>
+    </w:p>
+    <w:tbl>
+      <w:tblPr>
+        <w:tblStyle w:val="TableGrid"/>
+        <w:tblW w:type="dxa" w:w="9979"/>
+        <w:tblLayout w:type="fixed"/>
+        <w:tblLook w:firstColumn="1" w:firstRow="1" w:lastColumn="0" w:lastRow="0" w:noHBand="0" w:noVBand="1" w:val="04A0"/>
+      </w:tblPr>
+      <w:tblGrid>
+        <w:gridCol w:w="1814"/>
+        <w:gridCol w:w="2721"/>
+        <w:gridCol w:w="2721"/>
+        <w:gridCol w:w="2721"/>
+      </w:tblGrid>
+      <w:tr>
+        <w:trPr>
+          <w:tblHeader w:val="true"/>
+        </w:trPr>
+        <w:tc>
+          <w:tcPr>
+            <w:tcW w:type="dxa" w:w="1814"/>
+            <w:shd w:val="clear" w:color="auto" w:fill="1E2A24"/>
+            <w:vAlign w:val="top"/>
+          </w:tcPr>
+          <w:p>
+            <w:pPr>
+              <w:spacing w:after="40" w:before="40"/>
+            </w:pPr>
+            <w:r>
+              <w:rPr>
+                <w:rFonts w:ascii="Calibri" w:hAnsi="Calibri" w:eastAsia="Calibri"/>
+                <w:b/>
+                <w:i w:val="0"/>
+                <w:color w:val="F4F1EA"/>
+                <w:sz w:val="20"/>
+              </w:rPr>
+              <w:t>Вопрос</w:t>
+            </w:r>
+          </w:p>
+        </w:tc>
+        <w:tc>
+          <w:tcPr>
+            <w:tcW w:type="dxa" w:w="2721"/>
+            <w:shd w:val="clear" w:color="auto" w:fill="1E2A24"/>
+            <w:vAlign w:val="top"/>
+          </w:tcPr>
+          <w:p>
+            <w:pPr>
+              <w:spacing w:after="40" w:before="40"/>
+            </w:pPr>
+            <w:r>
+              <w:rPr>
+                <w:rFonts w:ascii="Calibri" w:hAnsi="Calibri" w:eastAsia="Calibri"/>
+                <w:b/>
+                <w:i w:val="0"/>
+                <w:color w:val="F4F1EA"/>
+                <w:sz w:val="20"/>
+              </w:rPr>
+              <w:t>Разбор поддержки</w:t>
+            </w:r>
+          </w:p>
+        </w:tc>
+        <w:tc>
+          <w:tcPr>
+            <w:tcW w:type="dxa" w:w="2721"/>
+            <w:shd w:val="clear" w:color="auto" w:fill="1E2A24"/>
+            <w:vAlign w:val="top"/>
+          </w:tcPr>
+          <w:p>
+            <w:pPr>
+              <w:spacing w:after="40" w:before="40"/>
+            </w:pPr>
+            <w:r>
+              <w:rPr>
+                <w:rFonts w:ascii="Calibri" w:hAnsi="Calibri" w:eastAsia="Calibri"/>
+                <w:b/>
+                <w:i w:val="0"/>
+                <w:color w:val="F4F1EA"/>
+                <w:sz w:val="20"/>
+              </w:rPr>
+              <w:t>Чат</w:t>
+            </w:r>
+          </w:p>
+        </w:tc>
+        <w:tc>
+          <w:tcPr>
+            <w:tcW w:type="dxa" w:w="2721"/>
+            <w:shd w:val="clear" w:color="auto" w:fill="1E2A24"/>
+            <w:vAlign w:val="top"/>
+          </w:tcPr>
+          <w:p>
+            <w:pPr>
+              <w:spacing w:after="40" w:before="40"/>
+            </w:pPr>
+            <w:r>
+              <w:rPr>
+                <w:rFonts w:ascii="Calibri" w:hAnsi="Calibri" w:eastAsia="Calibri"/>
+                <w:b/>
+                <w:i w:val="0"/>
+                <w:color w:val="F4F1EA"/>
+                <w:sz w:val="20"/>
+              </w:rPr>
+              <w:t>Как держим</w:t>
+            </w:r>
+          </w:p>
+        </w:tc>
+      </w:tr>
+      <w:tr>
+        <w:tc>
+          <w:tcPr>
+            <w:tcW w:type="dxa" w:w="1814"/>
+            <w:vAlign w:val="top"/>
+          </w:tcPr>
+          <w:p>
+            <w:pPr>
+              <w:spacing w:after="40" w:before="40"/>
+            </w:pPr>
+            <w:r>
+              <w:rPr>
+                <w:rFonts w:ascii="Calibri" w:hAnsi="Calibri" w:eastAsia="Calibri"/>
+                <w:b w:val="0"/>
+                <w:i w:val="0"/>
+                <w:sz w:val="20"/>
+              </w:rPr>
+              <w:t>Где стоит сайт</w:t>
+            </w:r>
+          </w:p>
+        </w:tc>
+        <w:tc>
+          <w:tcPr>
+            <w:tcW w:type="dxa" w:w="2721"/>
+            <w:vAlign w:val="top"/>
+          </w:tcPr>
+          <w:p>
+            <w:pPr>
+              <w:spacing w:after="40" w:before="40"/>
+            </w:pPr>
+            <w:r>
+              <w:rPr>
+                <w:rFonts w:ascii="Calibri" w:hAnsi="Calibri" w:eastAsia="Calibri"/>
+                <w:b w:val="0"/>
+                <w:i w:val="0"/>
+                <w:sz w:val="20"/>
+              </w:rPr>
+              <w:t>Битрикс24 назван один раз, в HD-8205, как запасной чат вместо Jivo. Коробка — допущение плана, не находка выгрузки.</w:t>
+            </w:r>
+          </w:p>
+        </w:tc>
+        <w:tc>
+          <w:tcPr>
+            <w:tcW w:type="dxa" w:w="2721"/>
+            <w:vAlign w:val="top"/>
+          </w:tcPr>
+          <w:p>
+            <w:pPr>
+              <w:spacing w:after="40" w:before="40"/>
+            </w:pPr>
+            <w:r>
+              <w:rPr>
+                <w:rFonts w:ascii="Calibri" w:hAnsi="Calibri" w:eastAsia="Calibri"/>
+                <w:b w:val="0"/>
+                <w:i w:val="0"/>
+                <w:sz w:val="20"/>
+              </w:rPr>
+              <w:t>В одном разговоре три продукта: 1С-Битрикс с монитором качества, облако Битрикс24 и чужая коробка, которая должна стать своей.</w:t>
+            </w:r>
+          </w:p>
+        </w:tc>
+        <w:tc>
+          <w:tcPr>
+            <w:tcW w:type="dxa" w:w="2721"/>
+            <w:vAlign w:val="top"/>
+          </w:tcPr>
+          <w:p>
+            <w:pPr>
+              <w:spacing w:after="40" w:before="40"/>
+            </w:pPr>
+            <w:r>
+              <w:rPr>
+                <w:rFonts w:ascii="Calibri" w:hAnsi="Calibri" w:eastAsia="Calibri"/>
+                <w:b w:val="0"/>
+                <w:i w:val="0"/>
+                <w:sz w:val="20"/>
+              </w:rPr>
+              <w:t>Держим коробку. Облако и монитор качества не применяем, пока инвентаризация не покажет другой продукт.</w:t>
+            </w:r>
+          </w:p>
+        </w:tc>
+      </w:tr>
+      <w:tr>
+        <w:tc>
+          <w:tcPr>
+            <w:tcW w:type="dxa" w:w="1814"/>
+            <w:shd w:val="clear" w:color="auto" w:fill="F7F4EE"/>
+            <w:vAlign w:val="top"/>
+          </w:tcPr>
+          <w:p>
+            <w:pPr>
+              <w:spacing w:after="40" w:before="40"/>
+            </w:pPr>
+            <w:r>
+              <w:rPr>
+                <w:rFonts w:ascii="Calibri" w:hAnsi="Calibri" w:eastAsia="Calibri"/>
+                <w:b w:val="0"/>
+                <w:i w:val="0"/>
+                <w:sz w:val="20"/>
+              </w:rPr>
+              <w:t>Куда падает заявка</w:t>
+            </w:r>
+          </w:p>
+        </w:tc>
+        <w:tc>
+          <w:tcPr>
+            <w:tcW w:type="dxa" w:w="2721"/>
+            <w:shd w:val="clear" w:color="auto" w:fill="F7F4EE"/>
+            <w:vAlign w:val="top"/>
+          </w:tcPr>
+          <w:p>
+            <w:pPr>
+              <w:spacing w:after="40" w:before="40"/>
+            </w:pPr>
+            <w:r>
+              <w:rPr>
+                <w:rFonts w:ascii="Calibri" w:hAnsi="Calibri" w:eastAsia="Calibri"/>
+                <w:b w:val="0"/>
+                <w:i w:val="0"/>
+                <w:sz w:val="20"/>
+              </w:rPr>
+              <w:t>Коллбэк лендинга идёт в Macro. Каталог сверяют с Macro. Движ даёт ставку на карточке.</w:t>
+            </w:r>
+          </w:p>
+        </w:tc>
+        <w:tc>
+          <w:tcPr>
+            <w:tcW w:type="dxa" w:w="2721"/>
+            <w:shd w:val="clear" w:color="auto" w:fill="F7F4EE"/>
+            <w:vAlign w:val="top"/>
+          </w:tcPr>
+          <w:p>
+            <w:pPr>
+              <w:spacing w:after="40" w:before="40"/>
+            </w:pPr>
+            <w:r>
+              <w:rPr>
+                <w:rFonts w:ascii="Calibri" w:hAnsi="Calibri" w:eastAsia="Calibri"/>
+                <w:b w:val="0"/>
+                <w:i w:val="0"/>
+                <w:sz w:val="20"/>
+              </w:rPr>
+              <w:t>Форма должна создать сделку в CRM Битрикс24 с источником и ответственным.</w:t>
+            </w:r>
+          </w:p>
+        </w:tc>
+        <w:tc>
+          <w:tcPr>
+            <w:tcW w:type="dxa" w:w="2721"/>
+            <w:shd w:val="clear" w:color="auto" w:fill="F7F4EE"/>
+            <w:vAlign w:val="top"/>
+          </w:tcPr>
+          <w:p>
+            <w:pPr>
+              <w:spacing w:after="40" w:before="40"/>
+            </w:pPr>
+            <w:r>
+              <w:rPr>
+                <w:rFonts w:ascii="Calibri" w:hAnsi="Calibri" w:eastAsia="Calibri"/>
+                <w:b w:val="0"/>
+                <w:i w:val="0"/>
+                <w:sz w:val="20"/>
+              </w:rPr>
+              <w:t>Приёмка проверяет Macro и Движ. Сделку коробки проверяют только если реестр вебхуков её показал.</w:t>
+            </w:r>
+          </w:p>
+        </w:tc>
+      </w:tr>
+      <w:tr>
+        <w:tc>
+          <w:tcPr>
+            <w:tcW w:type="dxa" w:w="1814"/>
+            <w:vAlign w:val="top"/>
+          </w:tcPr>
+          <w:p>
+            <w:pPr>
+              <w:spacing w:after="40" w:before="40"/>
+            </w:pPr>
+            <w:r>
+              <w:rPr>
+                <w:rFonts w:ascii="Calibri" w:hAnsi="Calibri" w:eastAsia="Calibri"/>
+                <w:b w:val="0"/>
+                <w:i w:val="0"/>
+                <w:sz w:val="20"/>
+              </w:rPr>
+              <w:t>Чат на сайте</w:t>
+            </w:r>
+          </w:p>
+        </w:tc>
+        <w:tc>
+          <w:tcPr>
+            <w:tcW w:type="dxa" w:w="2721"/>
+            <w:vAlign w:val="top"/>
+          </w:tcPr>
+          <w:p>
+            <w:pPr>
+              <w:spacing w:after="40" w:before="40"/>
+            </w:pPr>
+            <w:r>
+              <w:rPr>
+                <w:rFonts w:ascii="Calibri" w:hAnsi="Calibri" w:eastAsia="Calibri"/>
+                <w:b w:val="0"/>
+                <w:i w:val="0"/>
+                <w:sz w:val="20"/>
+              </w:rPr>
+              <w:t>Jivo меняют на Mango. Чат Битрикс24 смотрели как запасной вариант, HD-8205.</w:t>
+            </w:r>
+          </w:p>
+        </w:tc>
+        <w:tc>
+          <w:tcPr>
+            <w:tcW w:type="dxa" w:w="2721"/>
+            <w:vAlign w:val="top"/>
+          </w:tcPr>
+          <w:p>
+            <w:pPr>
+              <w:spacing w:after="40" w:before="40"/>
+            </w:pPr>
+            <w:r>
+              <w:rPr>
+                <w:rFonts w:ascii="Calibri" w:hAnsi="Calibri" w:eastAsia="Calibri"/>
+                <w:b w:val="0"/>
+                <w:i w:val="0"/>
+                <w:sz w:val="20"/>
+              </w:rPr>
+              <w:t>Открытые линии, очередь операторов, чат-боты, Client ID и Client Secret.</w:t>
+            </w:r>
+          </w:p>
+        </w:tc>
+        <w:tc>
+          <w:tcPr>
+            <w:tcW w:type="dxa" w:w="2721"/>
+            <w:vAlign w:val="top"/>
+          </w:tcPr>
+          <w:p>
+            <w:pPr>
+              <w:spacing w:after="40" w:before="40"/>
+            </w:pPr>
+            <w:r>
+              <w:rPr>
+                <w:rFonts w:ascii="Calibri" w:hAnsi="Calibri" w:eastAsia="Calibri"/>
+                <w:b w:val="0"/>
+                <w:i w:val="0"/>
+                <w:sz w:val="20"/>
+              </w:rPr>
+              <w:t>Ботов и открытые линии не считаем фактом. Просим показать, есть ли они. Полис-онлайн остаётся заявкой HD-15790.</w:t>
+            </w:r>
+          </w:p>
+        </w:tc>
+      </w:tr>
+      <w:tr>
+        <w:tc>
+          <w:tcPr>
+            <w:tcW w:type="dxa" w:w="1814"/>
+            <w:shd w:val="clear" w:color="auto" w:fill="F7F4EE"/>
+            <w:vAlign w:val="top"/>
+          </w:tcPr>
+          <w:p>
+            <w:pPr>
+              <w:spacing w:after="40" w:before="40"/>
+            </w:pPr>
+            <w:r>
+              <w:rPr>
+                <w:rFonts w:ascii="Calibri" w:hAnsi="Calibri" w:eastAsia="Calibri"/>
+                <w:b w:val="0"/>
+                <w:i w:val="0"/>
+                <w:sz w:val="20"/>
+              </w:rPr>
+              <w:t>Оплата</w:t>
+            </w:r>
+          </w:p>
+        </w:tc>
+        <w:tc>
+          <w:tcPr>
+            <w:tcW w:type="dxa" w:w="2721"/>
+            <w:shd w:val="clear" w:color="auto" w:fill="F7F4EE"/>
+            <w:vAlign w:val="top"/>
+          </w:tcPr>
+          <w:p>
+            <w:pPr>
+              <w:spacing w:after="40" w:before="40"/>
+            </w:pPr>
+            <w:r>
+              <w:rPr>
+                <w:rFonts w:ascii="Calibri" w:hAnsi="Calibri" w:eastAsia="Calibri"/>
+                <w:b w:val="0"/>
+                <w:i w:val="0"/>
+                <w:sz w:val="20"/>
+              </w:rPr>
+              <w:t>Провайдер не назван. Ломаются бронь и услуги ССК, в том числе срок и сумма.</w:t>
+            </w:r>
+          </w:p>
+        </w:tc>
+        <w:tc>
+          <w:tcPr>
+            <w:tcW w:type="dxa" w:w="2721"/>
+            <w:shd w:val="clear" w:color="auto" w:fill="F7F4EE"/>
+            <w:vAlign w:val="top"/>
+          </w:tcPr>
+          <w:p>
+            <w:pPr>
+              <w:spacing w:after="40" w:before="40"/>
+            </w:pPr>
+            <w:r>
+              <w:rPr>
+                <w:rFonts w:ascii="Calibri" w:hAnsi="Calibri" w:eastAsia="Calibri"/>
+                <w:b w:val="0"/>
+                <w:i w:val="0"/>
+                <w:sz w:val="20"/>
+              </w:rPr>
+              <w:t>Примеры кабинетов: ЮKassa, Тинькофф. На бою не должен остаться тестовый ключ. Нужен лог «деньги списались, заказа нет».</w:t>
+            </w:r>
+          </w:p>
+        </w:tc>
+        <w:tc>
+          <w:tcPr>
+            <w:tcW w:type="dxa" w:w="2721"/>
+            <w:shd w:val="clear" w:color="auto" w:fill="F7F4EE"/>
+            <w:vAlign w:val="top"/>
+          </w:tcPr>
+          <w:p>
+            <w:pPr>
+              <w:spacing w:after="40" w:before="40"/>
+            </w:pPr>
+            <w:r>
+              <w:rPr>
+                <w:rFonts w:ascii="Calibri" w:hAnsi="Calibri" w:eastAsia="Calibri"/>
+                <w:b w:val="0"/>
+                <w:i w:val="0"/>
+                <w:sz w:val="20"/>
+              </w:rPr>
+              <w:t>Имена из примеров не берём. Берём режим ключа и место логов плюс сценарии из разбора.</w:t>
+            </w:r>
+          </w:p>
+        </w:tc>
+      </w:tr>
+      <w:tr>
+        <w:tc>
+          <w:tcPr>
+            <w:tcW w:type="dxa" w:w="1814"/>
+            <w:vAlign w:val="top"/>
+          </w:tcPr>
+          <w:p>
+            <w:pPr>
+              <w:spacing w:after="40" w:before="40"/>
+            </w:pPr>
+            <w:r>
+              <w:rPr>
+                <w:rFonts w:ascii="Calibri" w:hAnsi="Calibri" w:eastAsia="Calibri"/>
+                <w:b w:val="0"/>
+                <w:i w:val="0"/>
+                <w:sz w:val="20"/>
+              </w:rPr>
+              <w:t>Как правят контент</w:t>
+            </w:r>
+          </w:p>
+        </w:tc>
+        <w:tc>
+          <w:tcPr>
+            <w:tcW w:type="dxa" w:w="2721"/>
+            <w:vAlign w:val="top"/>
+          </w:tcPr>
+          <w:p>
+            <w:pPr>
+              <w:spacing w:after="40" w:before="40"/>
+            </w:pPr>
+            <w:r>
+              <w:rPr>
+                <w:rFonts w:ascii="Calibri" w:hAnsi="Calibri" w:eastAsia="Calibri"/>
+                <w:b w:val="0"/>
+                <w:i w:val="0"/>
+                <w:sz w:val="20"/>
+              </w:rPr>
+              <w:t>Заявки. Картинки с Яндекс Диска, Google Doc и Figma, не из админки автора.</w:t>
+            </w:r>
+          </w:p>
+        </w:tc>
+        <w:tc>
+          <w:tcPr>
+            <w:tcW w:type="dxa" w:w="2721"/>
+            <w:vAlign w:val="top"/>
+          </w:tcPr>
+          <w:p>
+            <w:pPr>
+              <w:spacing w:after="40" w:before="40"/>
+            </w:pPr>
+            <w:r>
+              <w:rPr>
+                <w:rFonts w:ascii="Calibri" w:hAnsi="Calibri" w:eastAsia="Calibri"/>
+                <w:b w:val="0"/>
+                <w:i w:val="0"/>
+                <w:sz w:val="20"/>
+              </w:rPr>
+              <w:t>Облако: права визуального конструктора. «Управление сайтом»: группы, контент и инфоблоки.</w:t>
+            </w:r>
+          </w:p>
+        </w:tc>
+        <w:tc>
+          <w:tcPr>
+            <w:tcW w:type="dxa" w:w="2721"/>
+            <w:vAlign w:val="top"/>
+          </w:tcPr>
+          <w:p>
+            <w:pPr>
+              <w:spacing w:after="40" w:before="40"/>
+            </w:pPr>
+            <w:r>
+              <w:rPr>
+                <w:rFonts w:ascii="Calibri" w:hAnsi="Calibri" w:eastAsia="Calibri"/>
+                <w:b w:val="0"/>
+                <w:i w:val="0"/>
+                <w:sz w:val="20"/>
+              </w:rPr>
+              <w:t>Для коробки Битрикс24 берём группу редактора без настроек модулей. Конструктор облака и дерево инфоблоков не требуем, пока не увидим этот продукт.</w:t>
+            </w:r>
+          </w:p>
+        </w:tc>
+      </w:tr>
+      <w:tr>
+        <w:tc>
+          <w:tcPr>
+            <w:tcW w:type="dxa" w:w="1814"/>
+            <w:shd w:val="clear" w:color="auto" w:fill="F7F4EE"/>
+            <w:vAlign w:val="top"/>
+          </w:tcPr>
+          <w:p>
+            <w:pPr>
+              <w:spacing w:after="40" w:before="40"/>
+            </w:pPr>
+            <w:r>
+              <w:rPr>
+                <w:rFonts w:ascii="Calibri" w:hAnsi="Calibri" w:eastAsia="Calibri"/>
+                <w:b w:val="0"/>
+                <w:i w:val="0"/>
+                <w:sz w:val="20"/>
+              </w:rPr>
+              <w:t>Как переносятся данные</w:t>
+            </w:r>
+          </w:p>
+        </w:tc>
+        <w:tc>
+          <w:tcPr>
+            <w:tcW w:type="dxa" w:w="2721"/>
+            <w:shd w:val="clear" w:color="auto" w:fill="F7F4EE"/>
+            <w:vAlign w:val="top"/>
+          </w:tcPr>
+          <w:p>
+            <w:pPr>
+              <w:spacing w:after="40" w:before="40"/>
+            </w:pPr>
+            <w:r>
+              <w:rPr>
+                <w:rFonts w:ascii="Calibri" w:hAnsi="Calibri" w:eastAsia="Calibri"/>
+                <w:b w:val="0"/>
+                <w:i w:val="0"/>
+                <w:sz w:val="20"/>
+              </w:rPr>
+              <w:t>Механизм переноса выгрузка не описывает.</w:t>
+            </w:r>
+          </w:p>
+        </w:tc>
+        <w:tc>
+          <w:tcPr>
+            <w:tcW w:type="dxa" w:w="2721"/>
+            <w:shd w:val="clear" w:color="auto" w:fill="F7F4EE"/>
+            <w:vAlign w:val="top"/>
+          </w:tcPr>
+          <w:p>
+            <w:pPr>
+              <w:spacing w:after="40" w:before="40"/>
+            </w:pPr>
+            <w:r>
+              <w:rPr>
+                <w:rFonts w:ascii="Calibri" w:hAnsi="Calibri" w:eastAsia="Calibri"/>
+                <w:b w:val="0"/>
+                <w:i w:val="0"/>
+                <w:sz w:val="20"/>
+              </w:rPr>
+              <w:t>Облако: экспорт несёт шаблон, база клиентов остаётся на портале. Коробка: дамп, файлы, Git, сервер, ключ.</w:t>
+            </w:r>
+          </w:p>
+        </w:tc>
+        <w:tc>
+          <w:tcPr>
+            <w:tcW w:type="dxa" w:w="2721"/>
+            <w:shd w:val="clear" w:color="auto" w:fill="F7F4EE"/>
+            <w:vAlign w:val="top"/>
+          </w:tcPr>
+          <w:p>
+            <w:pPr>
+              <w:spacing w:after="40" w:before="40"/>
+            </w:pPr>
+            <w:r>
+              <w:rPr>
+                <w:rFonts w:ascii="Calibri" w:hAnsi="Calibri" w:eastAsia="Calibri"/>
+                <w:b w:val="0"/>
+                <w:i w:val="0"/>
+                <w:sz w:val="20"/>
+              </w:rPr>
+              <w:t>Для допущения коробки берём дамп, файлы, Git и ключ. Экспорт шаблона способом переноса не является.</w:t>
+            </w:r>
+          </w:p>
+        </w:tc>
+      </w:tr>
+    </w:tbl>
+    <w:p/>
     <w:sectPr>
       <w:headerReference w:type="default" r:id="rId9"/>
       <w:footerReference w:type="default" r:id="rId10"/>

</xml_diff>

<commit_message>
Edit the ENKO site handover plan
Replace the Word, HTML, and canvas copies in docs/.
</commit_message>
<xml_diff>
--- a/docs/site-handover-plan.docx
+++ b/docs/site-handover-plan.docx
@@ -19,7 +19,7 @@
           <w:color w:val="5C564C"/>
           <w:sz w:val="22"/>
         </w:rPr>
-        <w:t>План и чеклист, чтобы забрать продающий сайт с чужой коробки Битрикс24 и оставить его у заказчика. Источник один: общий чат о приёмке такого сайта. Чат сам отделяет коробку от облака. Облачные шаги в работу не входят.</w:t>
+        <w:t>План и чеклист, чтобы забрать продающий сайт с чужой коробки Битрикс24 и оставить его у заказчика. Коробка и облако принимаются по-разному. Облачные шаги в работу не входят.</w:t>
       </w:r>
     </w:p>
     <w:tbl>
@@ -60,7 +60,7 @@
                 <w:i w:val="0"/>
                 <w:sz w:val="22"/>
               </w:rPr>
-              <w:t>Сервер сейчас чужой, а право на него должно быть у заказчика. Пока нет root, лицензионного ключа на аккаунте заказчика и кода, сайт можно выключить вместе с подрядчиком. В чате есть сводный чек-лист с заголовком «Битрикс24 (облако)». Его облачные пункты сюда не перенесены.</w:t>
+              <w:t>Сервер сейчас чужой, а право на него должно быть у заказчика. Пока нет root, лицензионного ключа на аккаунте заказчика и кода, сайт можно выключить вместе с подрядчиком.</w:t>
             </w:r>
           </w:p>
         </w:tc>
@@ -77,7 +77,7 @@
     </w:p>
     <w:p>
       <w:r>
-        <w:t>Шаги идут из чата: сначала собственность на сервер и ключ, затем доступы и связки, затем испытания и акт. Без подписанного акта чат не советует переводить финальный платёж.</w:t>
+        <w:t>Сначала собственность на сервер и ключ, затем доступы и связки, затем испытания и акт. Без подписанного акта финальный платёж не переводят.</w:t>
       </w:r>
     </w:p>
     <w:p>
@@ -146,12 +146,12 @@
     </w:p>
     <w:p>
       <w:r>
-        <w:t>Чат прямо говорит: управление контентом в облаке Битрикс24 устроено иначе, чем в коробке. Облако держится на ролях конструктора. Коробка держится на сервере, лицензионном ключе и коде.</w:t>
+        <w:t>Управление контентом в облаке Битрикс24 устроено иначе, чем в коробке. Облако держится на ролях конструктора. Коробка держится на сервере, лицензионном ключе и коде.</w:t>
       </w:r>
     </w:p>
     <w:p>
       <w:r>
-        <w:t>Последний вопрос чата формулирует задачу так: сайт на Битрикс24 стоит на чужой коробке, а должен стоять на своей. Отсюда три вещи, которых в облаке нет. Код забирают целиком: в облаке его нет, там аренда сервиса. Ключ коробки живёт в кабинете 1С-Битрикс и должен быть на компании заказчика. Сервер описывают физически: кому принадлежит машина или виртуальная машина, какой IP, какой root.</w:t>
+        <w:t>Сайт на Битрикс24 стоит на чужой коробке, а должен стоять на своей. В облаке кода нет: там аренда сервиса. Ключ коробки живёт в кабинете 1С-Битрикс и должен быть на компании заказчика. Сервер описывают физически: кому принадлежит машина или виртуальная машина, какой IP, какой root.</w:t>
       </w:r>
     </w:p>
     <w:p>
@@ -195,7 +195,7 @@
     </w:p>
     <w:p>
       <w:r>
-        <w:t>Лицензия действует 12 месяцев. Льготное продление чат ограничивает окном: за 90 дней до окончания и в течение 15 дней после. Пропуск окна означает полную цену продления. Обновления и поддержка вендора при этом встают. Чат отдельно пишет, что после окончания срока недоступен Маркетплейс, перестают отвечать REST и вебхуки, отключаются облачная телефония, CRM-формы и чат-боты. Это не только «нельзя обновиться».</w:t>
+        <w:t>Лицензия действует 12 месяцев. Льготное продление ограничено окном: за 90 дней до окончания и в течение 15 дней после. Пропуск окна означает полную цену продления. Обновления и поддержка вендора при этом встают. После окончания срока недоступен Маркетплейс, перестают отвечать REST и вебхуки, отключаются облачная телефония, CRM-формы и чат-боты. Это не только «нельзя обновиться».</w:t>
       </w:r>
     </w:p>
     <w:p>
@@ -213,12 +213,12 @@
     </w:p>
     <w:p>
       <w:r>
-        <w:t>Git с историей коммитов за последний год. Архив zip чат красным флагом не называет достаточной передачей: красный флаг — когда репозитория нет. Кастомные компоненты лежат в /local/. Если они раскиданы по /bitrix/ вместе с ядром, обновление их сломает. Кастомизация личного кабинета тоже выносится в отдельные модули или обработчики событий, не в правки ядра.</w:t>
+        <w:t>Git с историей коммитов за последний год. Архива zip недостаточно: красный флаг — когда репозитория нет. Кастомные компоненты лежат в /local/. Если они раскиданы по /bitrix/ вместе с ядром, обновление их сломает. Кастомизация личного кабинета тоже выносится в отдельные модули или обработчики событий, не в правки ядра.</w:t>
       </w:r>
     </w:p>
     <w:p>
       <w:r>
-        <w:t>Спрашивают, когда последний раз обновляли ядро. Год без обновлений чат называет дырой. Выкладка ручным FTP — красный флаг: каждое обновление тогда зависит от руки. Нужен хотя бы простой контур сборки и выкладки. Порядок обновления: сначала резервная копия, потом тестовая среда, потом продуктив. Обновление боя «с риском» чат называет халатностью.</w:t>
+        <w:t>Спрашивают, когда последний раз обновляли ядро. Год без обновлений — дыра. Выкладка ручным FTP — красный флаг: каждое обновление тогда зависит от руки. Нужен хотя бы простой контур сборки и выкладки. Порядок обновления: сначала резервная копия, потом тестовая среда, потом продуктив. Обновление боя «с риском» — халатность.</w:t>
       </w:r>
     </w:p>
     <w:p>
@@ -231,7 +231,7 @@
     </w:p>
     <w:p>
       <w:r>
-        <w:t>На сервере коробки чат требует найти следы прежних подрядчиков. Смотрят ~/.ssh/authorized_keys на чужие публичные ключи. Смотрят учётные записи MySQL и удаляют посторонние. Меняют пароль root и у системы, и у MySQL. Смотрят crontab -l: нет ли заданий, которые сами ходят на серверы подрядчика.</w:t>
+        <w:t>На сервере коробки ищут следы прежних подрядчиков. Смотрят ~/.ssh/authorized_keys на чужие публичные ключи. Смотрят учётные записи MySQL и удаляют посторонние. Меняют пароль root и у системы, и у MySQL. Смотрят crontab -l: нет ли заданий, которые сами ходят на серверы подрядчика.</w:t>
       </w:r>
     </w:p>
     <w:p>
@@ -244,7 +244,7 @@
     </w:p>
     <w:p>
       <w:r>
-        <w:t>На момент сдачи отдают полный дамп базы и архив файлов. Отдельно чат просит экспорт CRM в XLS или CSV и шаблоны бизнес-процессов в .bpt: это копия автоматизации, не замена дампа. Фраза «бэкапы делает хостинг» ничего не значит, пока копию не развернули на тестовой среде. Если развернуть не могут, копии нет. В регламенте фиксируют, кто делает копии, куда и как часто.</w:t>
+        <w:t>На момент сдачи отдают полный дамп базы и архив файлов. Отдельно отдают экспорт CRM в XLS или CSV и шаблоны бизнес-процессов в .bpt: это копия автоматизации, не замена дампа. Фраза «бэкапы делает хостинг» ничего не значит, пока копию не развернули на тестовой среде. Если развернуть не могут, копии нет. В регламенте фиксируют, кто делает копии, куда и как часто.</w:t>
       </w:r>
     </w:p>
     <w:p>
@@ -265,7 +265,7 @@
     </w:p>
     <w:p>
       <w:r>
-        <w:t>У заказчика или его сотрудника полные права администратора: настройки модулей и управление пользователями. Он сам создаёт и меняет роли контент-менеджеров и операторов, без разработчика. Перед сменой паролей смотрят журнал событий и проверяют, что подрядчик не входил с чужих IP. После сдачи пароли подрядчика не действуют. Просьба «оставить свой доступ» — красный флаг. У администраторов включена двухфакторная аутентификация. Все пароли лежат в менеджере паролей или в защищённом документе, не в переписке и не в голове.</w:t>
+        <w:t>У заказчика или его сотрудника полные права администратора: настройки модулей и управление пользователями. Он сам создаёт и меняет роли контент-менеджеров и операторов, без разработчика. Перед сменой паролей смотрят журнал событий и проверяют, что подрядчик не входил с чужих IP. После сдачи пароли подрядчика не действуют. Просьба «оставить свой доступ» — красный флаг. У администраторов включена двухфакторная аутентификация. Все пароли лежат в менеджере паролей или в защищённом документе.</w:t>
       </w:r>
     </w:p>
     <w:p>
@@ -278,7 +278,7 @@
     </w:p>
     <w:p>
       <w:r>
-        <w:t>Нужен тестовый пользователь, который меняет текст и картинки и не входит в настройки модулей и в CRM. Он не может удалить сайт. Право публиковать проверяют отдельно от черновика только там, где чат говорит про облачный конструктор. Для коробки эту модель не применяют. Заказчик проверяет редактора сам, чтобы увидеть, не выданы ли лишние права.</w:t>
+        <w:t>Нужен тестовый пользователь, который меняет текст и картинки и не входит в настройки модулей и в CRM. Он не может удалить сайт. Отдельное право «Публикация» есть у облачного конструктора. В коробке эту модель не применяют. Заказчик проверяет редактора сам, чтобы увидеть, не выданы ли лишние права.</w:t>
       </w:r>
     </w:p>
     <w:p>
@@ -291,7 +291,7 @@
     </w:p>
     <w:p>
       <w:r>
-        <w:t>Чат просит не отчёт, а таблицу. Состав из чата такой.</w:t>
+        <w:t>Нужна таблица, не отчёт. Состав такой.</w:t>
       </w:r>
     </w:p>
     <w:tbl>
@@ -845,7 +845,7 @@
     <w:p/>
     <w:p>
       <w:r>
-        <w:t>Группам выдают минимально нужные права. Чат называет тест QSEC0030: у роли «Зарегистрированный пользователь» нет доступа к чужим заказам и к административным модулям. В кабинете нет лишних пользователей с правами администратора. Пароли стойкие. Пароль соединения с базой соответствует политике: цифры, буквы, специальные символы.</w:t>
+        <w:t>Группам выдают минимально нужные права. Тест QSEC0030: у роли «Зарегистрированный пользователь» нет доступа к чужим заказам и к административным модулям. В кабинете нет лишних пользователей с правами администратора. Пароли стойкие. Пароль соединения с базой соответствует политике: цифры, буквы, специальные символы.</w:t>
       </w:r>
     </w:p>
     <w:p>
@@ -858,7 +858,7 @@
     </w:p>
     <w:p>
       <w:r>
-        <w:t>Монитор качества систему проверяет, бизнес-логику кабинета — нет. Чат требует отдельные прогоны.</w:t>
+        <w:t>Монитор качества систему проверяет, бизнес-логику кабинета — нет. Кабинет прогоняют отдельно.</w:t>
       </w:r>
     </w:p>
     <w:p>
@@ -866,7 +866,7 @@
         <w:pStyle w:val="ListBullet"/>
       </w:pPr>
       <w:r>
-        <w:t>Под клиентом А открывают адрес заказа или профиля клиента Б. Чат показывает это на примере site.ru/personal/order/?ID=2 и на примере параметра ORDER_ID. Должен быть отказ, не чужой заказ.</w:t>
+        <w:t>Под клиентом А открывают адрес заказа или профиля клиента Б, например site.ru/personal/order/?ID=2 или ссылку с параметром ORDER_ID. Должен быть отказ, не чужой заказ.</w:t>
       </w:r>
     </w:p>
     <w:p>
@@ -898,7 +898,7 @@
         <w:pStyle w:val="ListBullet"/>
       </w:pPr>
       <w:r>
-        <w:t>Менеджер видит только своих клиентов. Чат говорит, что это делают группами пользователей или настройками модуля бизнес-процессов.</w:t>
+        <w:t>Менеджер видит только своих клиентов. Это делают группами пользователей или настройками модуля бизнес-процессов.</w:t>
       </w:r>
     </w:p>
     <w:p>
@@ -914,7 +914,7 @@
         <w:pStyle w:val="ListBullet"/>
       </w:pPr>
       <w:r>
-        <w:t>Есть карта ролей: какая группа к каким разделам кабинета допущена. Чат приводит примеры групп «Розничный клиент» и «Оптовик» как образец документа, не как обязательные имена.</w:t>
+        <w:t>Есть карта ролей: какая группа к каким разделам кабинета допущена. Группы вроде «Розничный клиент» и «Оптовик» — образец документа, не обязательные имена.</w:t>
       </w:r>
     </w:p>
     <w:p>
@@ -927,7 +927,7 @@
     </w:p>
     <w:p>
       <w:r>
-        <w:t>Чат называет этот блок самым рискованным: вебхуки часто висят на аккаунте подрядчика. После смены его пароля автоматизация встаёт. Пересоздают на администраторе заказчика до смены пароля.</w:t>
+        <w:t>Это самый рискованный блок: вебхуки часто висят на аккаунте подрядчика. После смены его пароля автоматизация встаёт. Пересоздают на администраторе заказчика до смены пароля.</w:t>
       </w:r>
     </w:p>
     <w:p>
@@ -948,7 +948,7 @@
         <w:pStyle w:val="ListBullet"/>
       </w:pPr>
       <w:r>
-        <w:t>Название. Чат приводит примеры: приём заявок с сайта, обмен с 1С, телефония. Обмен с 1С и телефонию проверяют, только если они есть.</w:t>
+        <w:t>Название, например: приём заявок с сайта, обмен с 1С, телефония. Обмен с 1С и телефонию проверяют, только если они есть.</w:t>
       </w:r>
     </w:p>
     <w:p>
@@ -980,7 +980,7 @@
         <w:pStyle w:val="ListBullet"/>
       </w:pPr>
       <w:r>
-        <w:t>Ключи интеграций, которые чат перечисляет в технической документации: платежи, доставка, CRM. Имена касс чат не фиксирует как единственные. В блоке платежей примеры кабинетов — ЮKassa и Тинькофф.</w:t>
+        <w:t>Ключи интеграций в технической документации: платежи, доставка, CRM. Примеры кабинетов оплаты — ЮKassa и Тинькофф.</w:t>
       </w:r>
     </w:p>
     <w:p>
@@ -993,7 +993,7 @@
     </w:p>
     <w:p>
       <w:r>
-        <w:t>После переноса проверяют то, что чат называет интеграциями из коробки: CRM-формы, виджеты на сайт и кассы, если магазин есть. Тестовая заявка с формы создаёт сделку в CRM с нужным источником и ответственным.</w:t>
+        <w:t>После переноса проверяют CRM-формы, виджеты на сайт и кассы, если магазин есть. Тестовая заявка с формы создаёт сделку в CRM с нужным источником и ответственным.</w:t>
       </w:r>
     </w:p>
     <w:p>
@@ -1054,7 +1054,7 @@
         <w:pStyle w:val="ListBullet"/>
       </w:pPr>
       <w:r>
-        <w:t>Если бот ходит во внешний сервис, забирают Client ID и Client Secret приложения из раздела «Разработчикам». Чат приводит пример такого сервиса: LLM-агент или конструктор ботов.</w:t>
+        <w:t>Если бот ходит во внешний сервис, забирают Client ID и Client Secret приложения из раздела «Разработчикам». Пример такого сервиса: LLM-агент или конструктор ботов.</w:t>
       </w:r>
     </w:p>
     <w:p>
@@ -1112,12 +1112,7 @@
     </w:p>
     <w:p>
       <w:r>
-        <w:t>Чат называет монитор качества встроенным инструментом сдачи проекта на 1С-Битрикс и оставляет его в наборе проверок, когда добирается до коробки: на бумаге протокол, а монитор — инструмент. Для коробки Битрикс24 облачный конструктор его не заменяет.</w:t>
-      </w:r>
-    </w:p>
-    <w:p>
-      <w:r>
-        <w:t>В чате есть пример сводного экрана: «выполнено 21 из 66», прогресс 31,8%, часть обязательных тестов ещё не пройдена. Это иллюстрация, как может выглядеть отчёт, не норматив и не результат конкретного сайта. Норматив чата другой.</w:t>
+        <w:t>Монитор качества — встроенный инструмент сдачи проекта на 1С-Битрикс. На бумаге протокол, монитор — инструмент. Для коробки Битрикс24 облачный конструктор его не заменяет.</w:t>
       </w:r>
     </w:p>
     <w:p>
@@ -1149,7 +1144,7 @@
         <w:pStyle w:val="ListBullet"/>
       </w:pPr>
       <w:r>
-        <w:t>В отчёте есть блоки, которые чат перечисляет для сдачи: безопасность, производительность, целостность ядра, настройки хостинга.</w:t>
+        <w:t>В отчёте есть блоки сдачи: безопасность, производительность, целостность ядра, настройки хостинга.</w:t>
       </w:r>
     </w:p>
     <w:p>
@@ -1170,7 +1165,7 @@
     </w:p>
     <w:p>
       <w:r>
-        <w:t>Подписанный протокол приёмо-сдаточных испытаний. Внутри утверждённая заранее программа и методика, статус «Пройдено» по пунктам задания и подпись, скриншоты или логи критичных сценариев. Фраза «всё работает, подписывайте акт» без протокола чат считает риском: потом не доказать, что было не так.</w:t>
+        <w:t>Подписанный протокол приёмо-сдаточных испытаний. Внутри утверждённая заранее программа и методика, статус «Пройдено» по пунктам задания и подпись, скриншоты или логи критичных сценариев. Фраза «всё работает, подписывайте акт» без протокола — риск: потом не доказать, что было не так.</w:t>
       </w:r>
     </w:p>
     <w:p>
@@ -1218,7 +1213,7 @@
         <w:pStyle w:val="ListBullet"/>
       </w:pPr>
       <w:r>
-        <w:t>Отдельно смотрят скорость ответа сервера, если монитор её не прошёл. В примере чата порог, после которого пункт красный, — генерация страницы дольше 2 секунд. Это иллюстрация непройденного теста, не отдельный норматив сверх монитора.</w:t>
+        <w:t>Если монитор не прошёл скорость ответа сервера, в подробном отчёте указан непройденный пункт.</w:t>
       </w:r>
     </w:p>
     <w:p>
@@ -1231,7 +1226,7 @@
     </w:p>
     <w:p>
       <w:r>
-        <w:t>Чат собирает это как дыры, которые всплывают после сдачи, когда разработчик пропадает. Всё критичное сидит на аккаунтах заказчика.</w:t>
+        <w:t>Это дыры, которые всплывают после сдачи, когда разработчик пропадает. Всё критичное сидит на аккаунтах заказчика.</w:t>
       </w:r>
     </w:p>
     <w:p>
@@ -1271,7 +1266,7 @@
         <w:pStyle w:val="ListBullet"/>
       </w:pPr>
       <w:r>
-        <w:t>Если на домене корпоративная почта — доступ к её панели. Записи SPF, DKIM и DMARC. Чат советует проверить их через MXToolbox. Без записей письма кабинета, подтверждение регистрации и чеки, уходят в спам.</w:t>
+        <w:t>Если на домене корпоративная почта — доступ к её панели. Записи SPF, DKIM и DMARC проверяют через MXToolbox. Без записей письма кабинета, подтверждение регистрации и чеки уходят в спам.</w:t>
       </w:r>
     </w:p>
     <w:p>
@@ -1303,7 +1298,7 @@
         <w:pStyle w:val="ListBullet"/>
       </w:pPr>
       <w:r>
-        <w:t>Доступ в личный кабинет эквайринга. Чат называет примеры: ЮKassa и Тинькофф. Других имён касс в чате нет.</w:t>
+        <w:t>Доступ в личный кабинет эквайринга. Примеры кабинетов: ЮKassa и Тинькофф.</w:t>
       </w:r>
     </w:p>
     <w:p>
@@ -1343,7 +1338,7 @@
         <w:pStyle w:val="ListBullet"/>
       </w:pPr>
       <w:r>
-        <w:t>Если внешний мониторинг уже настроен, доступ к нему у заказчика. Чат приводит UptimeRobot как пример такого сервиса, не как обязательную установку. Алерты о падении сайта идут заказчику. Если они идут разработчику, получателя меняют.</w:t>
+        <w:t>Если внешний мониторинг уже настроен, доступ к нему у заказчика. UptimeRobot — пример такого сервиса, не обязательная установка. Алерты о падении сайта идут заказчику. Если они идут разработчику, получателя меняют.</w:t>
       </w:r>
     </w:p>
     <w:p>
@@ -1367,7 +1362,7 @@
         <w:pStyle w:val="ListBullet"/>
       </w:pPr>
       <w:r>
-        <w:t>Сторонние библиотеки: какая лицензия. Чат отдельно предупреждает, что GPL может обязать открыть исходники.</w:t>
+        <w:t>Сторонние библиотеки: какая лицензия. GPL может обязать открыть исходники.</w:t>
       </w:r>
     </w:p>
     <w:p>
@@ -1388,7 +1383,7 @@
     </w:p>
     <w:p>
       <w:r>
-        <w:t>Акт приёма-передачи проходят вместе. Каждый пункт — «передан» или «нет, срок устранения». Без подписанного акта финальный платёж не переводят. Устный договор для чужой коробки чат считает пустым.</w:t>
+        <w:t>Акт приёма-передачи проходят вместе. Каждый пункт — «передан» или «нет, срок устранения». Без подписанного акта финальный платёж не переводят. Устный договор для чужой коробки пустой.</w:t>
       </w:r>
     </w:p>
     <w:p>
@@ -1404,7 +1399,7 @@
         <w:pStyle w:val="ListBullet"/>
       </w:pPr>
       <w:r>
-        <w:t>Единая точка входа: система тикетов с номерами. Частные решения через WeChat или телефон чат запрещает.</w:t>
+        <w:t>Единая точка входа: система тикетов с номерами. Частные решения через WeChat или телефон не принимают.</w:t>
       </w:r>
     </w:p>
     <w:p>
@@ -1420,7 +1415,7 @@
         <w:pStyle w:val="ListBullet"/>
       </w:pPr>
       <w:r>
-        <w:t>Для продающего сайта чат в начале разговора называет ориентир 15–30 минут на проблему с оплатой или на недоступность. В договоре коробки время всё равно расписывают по типам инцидентов, а не одной фразой.</w:t>
+        <w:t>Для продающего сайта ориентир на проблему с оплатой или на недоступность — 15–30 минут. В договоре время расписывают по типам инцидентов, а не одной фразой.</w:t>
       </w:r>
     </w:p>
     <w:p>
@@ -1436,7 +1431,7 @@
         <w:pStyle w:val="ListBullet"/>
       </w:pPr>
       <w:r>
-        <w:t>Срок бесплатного исправления ошибок, допущенных при разработке. Чат говорит, что обычно это от 1 до 3 месяцев. В акт пишут срок, который назвал подрядчик, а не эту вилку как уже согласованную.</w:t>
+        <w:t>Срок бесплатного исправления ошибок, допущенных при разработке, обычно от 1 до 3 месяцев. В акт пишут срок, который назвал подрядчик, а не эту вилку как уже согласованную.</w:t>
       </w:r>
     </w:p>
     <w:p>
@@ -1496,7 +1491,7 @@
                 <w:color w:val="F4F1EA"/>
                 <w:sz w:val="20"/>
               </w:rPr>
-              <w:t>Признак из чата</w:t>
+              <w:t>Признак</w:t>
             </w:r>
           </w:p>
         </w:tc>
@@ -1948,7 +1943,7 @@
                 <w:i w:val="0"/>
                 <w:sz w:val="20"/>
               </w:rPr>
-              <w:t>Чат считает это отказом от сдачи</w:t>
+              <w:t>Отказ от сдачи</w:t>
             </w:r>
           </w:p>
         </w:tc>
@@ -2034,7 +2029,7 @@
                 <w:i w:val="0"/>
                 <w:sz w:val="20"/>
               </w:rPr>
-              <w:t>Чат называет это дырой</w:t>
+              <w:t>Это дыра</w:t>
             </w:r>
           </w:p>
         </w:tc>
@@ -2056,7 +2051,7 @@
                 <w:i w:val="0"/>
                 <w:sz w:val="20"/>
               </w:rPr>
-              <w:t>Пароли в переписке или в голове</w:t>
+              <w:t>Пароли нигде не записаны</w:t>
             </w:r>
           </w:p>
         </w:tc>
@@ -2179,7 +2174,7 @@
     </w:p>
     <w:p>
       <w:r>
-        <w:t>Владелец взят из чата. Разработчик отдаёт и показывает. Заказчик принимает на свои аккаунты и меняет пароли. Вместе проходят акт, протокол и проверку восстановления.</w:t>
+        <w:t>Разработчик отдаёт и показывает. Заказчик принимает на свои аккаунты и меняет пароли. Вместе проходят акт, протокол и проверку восстановления.</w:t>
       </w:r>
     </w:p>
     <w:tbl>
@@ -3673,7 +3668,7 @@
                 <w:i w:val="0"/>
                 <w:sz w:val="20"/>
               </w:rPr>
-              <w:t>Сложить доступы в менеджер паролей. В переписку их не класть.</w:t>
+              <w:t>Сложить доступы в менеджер паролей.</w:t>
             </w:r>
           </w:p>
         </w:tc>
@@ -4681,7 +4676,7 @@
                 <w:i w:val="0"/>
                 <w:sz w:val="20"/>
               </w:rPr>
-              <w:t>Забрать Client ID и Client Secret бота, файл сценария и очередь открытых линий. Прогнать тестовый диалог.</w:t>
+              <w:t>Забрать Client ID и Client Secret чат-бота, файл сценария и очередь открытых линий. Прогнать тестовый диалог.</w:t>
             </w:r>
           </w:p>
         </w:tc>
@@ -5353,7 +5348,7 @@
                 <w:i w:val="0"/>
                 <w:sz w:val="20"/>
               </w:rPr>
-              <w:t>Передать редактирование аналитики, которую чат называет: Google Analytics или Яндекс.Метрика. Цели покупки, регистрации и звонка срабатывают. Коллтрекинг — если он есть.</w:t>
+              <w:t>Передать редактирование Google Analytics или Яндекс.Метрики. Цели покупки, регистрации и звонка срабатывают. Коллтрекинг — если он есть.</w:t>
             </w:r>
           </w:p>
         </w:tc>
@@ -5521,7 +5516,7 @@
                 <w:i w:val="0"/>
                 <w:sz w:val="20"/>
               </w:rPr>
-              <w:t>Передать кабинет эквайринга, боевой режим и место логов платежа. Чат называет примеры кабинетов: ЮKassa и Тинькофф.</w:t>
+              <w:t>Передать кабинет эквайринга, боевой режим и место логов платежа. Примеры кабинетов: ЮKassa и Тинькофф.</w:t>
             </w:r>
           </w:p>
         </w:tc>
@@ -5689,7 +5684,7 @@
                 <w:i w:val="0"/>
                 <w:sz w:val="20"/>
               </w:rPr>
-              <w:t>Если мониторинг уже есть, перевести алерты на заказчика. UptimeRobot в чате — пример, не обязательная установка.</w:t>
+              <w:t>Если мониторинг уже есть, перевести алерты на заказчика. UptimeRobot — пример, не обязательная установка.</w:t>
             </w:r>
           </w:p>
         </w:tc>
@@ -6025,7 +6020,7 @@
                 <w:i w:val="0"/>
                 <w:sz w:val="20"/>
               </w:rPr>
-              <w:t>Записать периодичность обновлений, копий и мониторинга и фактический гарантийный срок. Вилка «1–3 месяца» в чате — обычная, не уже согласованная.</w:t>
+              <w:t>Записать периодичность обновлений, копий и мониторинга и фактический гарантийный срок. Вилка «1–3 месяца» — обычный ориентир, не уже согласованный срок.</w:t>
             </w:r>
           </w:p>
         </w:tc>
@@ -6225,12 +6220,12 @@
         <w:pStyle w:val="Heading2"/>
       </w:pPr>
       <w:r>
-        <w:t>Что в чате есть, но это не коробка</w:t>
+        <w:t>Не коробка</w:t>
       </w:r>
     </w:p>
     <w:p>
       <w:r>
-        <w:t>Ниже пункты, которые чат сам относит к облаку Битрикс24 или к другому продукту. В чеклист коробки они не входят.</w:t>
+        <w:t>Эти пункты относятся к облаку Битрикс24 или к «1С-Битрикс: Управление сайтом». В чеклист коробки они не входят.</w:t>
       </w:r>
     </w:p>
     <w:tbl>
@@ -6266,7 +6261,7 @@
                 <w:color w:val="F4F1EA"/>
                 <w:sz w:val="20"/>
               </w:rPr>
-              <w:t>Пункт чата</w:t>
+              <w:t>Пункт</w:t>
             </w:r>
           </w:p>
         </w:tc>
@@ -6330,7 +6325,7 @@
                 <w:i w:val="0"/>
                 <w:sz w:val="20"/>
               </w:rPr>
-              <w:t>Чат помечает это как облако Битрикс24. Без права «Публикация» там нельзя выложить страницу. У коробки другая модель прав.</w:t>
+              <w:t>Это облако Битрикс24. Без права «Публикация» там нельзя выложить страницу. У коробки другая модель прав.</w:t>
             </w:r>
           </w:p>
         </w:tc>
@@ -6374,7 +6369,7 @@
                 <w:i w:val="0"/>
                 <w:sz w:val="20"/>
               </w:rPr>
-              <w:t>Чат противопоставляет облачные роли коробочной админке. В плане коробки остаётся полный администратор и группы, не конструктор.</w:t>
+              <w:t>Облачные роли живут в этом разделе. В плане коробки остаётся полный администратор и группы, не конструктор.</w:t>
             </w:r>
           </w:p>
         </w:tc>
@@ -6416,7 +6411,7 @@
                 <w:i w:val="0"/>
                 <w:sz w:val="20"/>
               </w:rPr>
-              <w:t>Так чат описывает облачный перенос. Коробку переносят дампом, файлами, Git и ключом.</w:t>
+              <w:t>Так устроен облачный перенос. Коробку переносят дампом, файлами, Git и ключом.</w:t>
             </w:r>
           </w:p>
         </w:tc>
@@ -6460,7 +6455,7 @@
                 <w:i w:val="0"/>
                 <w:sz w:val="20"/>
               </w:rPr>
-              <w:t>Это сборка облачного варианта. В план коробки из неё взято только то, что чат не помечает как облачный интерфейс и что повторяет в ответе про чужую коробку.</w:t>
+              <w:t>Это документ облачного варианта. Приёмка коробки идёт по серверу, ключу и коду.</w:t>
             </w:r>
           </w:p>
         </w:tc>
@@ -6502,7 +6497,7 @@
                 <w:i w:val="0"/>
                 <w:sz w:val="20"/>
               </w:rPr>
-              <w:t>Верно для облака. Для коробки чат требует обратное: Git, /local/ и исходные тексты.</w:t>
+              <w:t>В облаке кода нет, это аренда. Для коробки нужны Git, /local/ и исходные тексты.</w:t>
             </w:r>
           </w:p>
         </w:tc>
@@ -6546,18 +6541,13 @@
                 <w:i w:val="0"/>
                 <w:sz w:val="20"/>
               </w:rPr>
-              <w:t>Чат относит их к «1С-Битрикс: Управление сайтом», не к облаку и не к ответу про коробку Битрикс24. Проверка редактора без доступа к настройкам в плане остаётся, имена этих разделов — нет.</w:t>
+              <w:t>Эти имена меню относятся к «1С-Битрикс: Управление сайтом». Проверка редактора без доступа к настройкам в плане остаётся, имена этих разделов — нет.</w:t>
             </w:r>
           </w:p>
         </w:tc>
       </w:tr>
     </w:tbl>
     <w:p/>
-    <w:p>
-      <w:r>
-        <w:t>Цифры примера монитора качества, «21 из 66» и «31,8%», в чеклист не входят: чат подписывает их как пример экрана.</w:t>
-      </w:r>
-    </w:p>
     <w:sectPr>
       <w:headerReference w:type="default" r:id="rId9"/>
       <w:footerReference w:type="default" r:id="rId10"/>

</xml_diff>